<commit_message>
one session per station
</commit_message>
<xml_diff>
--- a/ПЗ 22-ЗИЭ-1 Петрачков А.Е. — Петров.docx
+++ b/ПЗ 22-ЗИЭ-1 Петрачков А.Е. — Петров.docx
@@ -193,21 +193,7 @@
           <w:szCs w:val="28"/>
         </w:rPr>
         <w:tab/>
-        <w:t>«___</w:t>
-      </w:r>
-      <w:proofErr w:type="gramStart"/>
-      <w:r>
-        <w:rPr>
-          <w:szCs w:val="28"/>
-        </w:rPr>
-        <w:t>_»_</w:t>
-      </w:r>
-      <w:proofErr w:type="gramEnd"/>
-      <w:r>
-        <w:rPr>
-          <w:szCs w:val="28"/>
-        </w:rPr>
-        <w:t>______________20__ г.</w:t>
+        <w:t>«____»_______________20__ г.</w:t>
       </w:r>
     </w:p>
     <w:p>
@@ -419,21 +405,12 @@
                 <w:szCs w:val="28"/>
               </w:rPr>
             </w:pPr>
-            <w:proofErr w:type="spellStart"/>
             <w:r>
               <w:rPr>
                 <w:rFonts w:cs="Times New Roman"/>
                 <w:szCs w:val="28"/>
               </w:rPr>
-              <w:t>к.п.н</w:t>
-            </w:r>
-            <w:proofErr w:type="spellEnd"/>
-            <w:r>
-              <w:rPr>
-                <w:rFonts w:cs="Times New Roman"/>
-                <w:szCs w:val="28"/>
-              </w:rPr>
-              <w:t>., доцент</w:t>
+              <w:t>к.п.н., доцент</w:t>
             </w:r>
           </w:p>
           <w:p>
@@ -488,7 +465,6 @@
                 <w:szCs w:val="28"/>
               </w:rPr>
             </w:pPr>
-            <w:proofErr w:type="spellStart"/>
             <w:r>
               <w:rPr>
                 <w:rFonts w:cs="Times New Roman"/>
@@ -496,7 +472,6 @@
               </w:rPr>
               <w:t>Нормоконтролер</w:t>
             </w:r>
-            <w:proofErr w:type="spellEnd"/>
           </w:p>
           <w:p>
             <w:pPr>
@@ -2863,7 +2838,7 @@
             <w:noProof/>
             <w:webHidden/>
           </w:rPr>
-          <w:t>53</w:t>
+          <w:t>55</w:t>
         </w:r>
         <w:r>
           <w:rPr>
@@ -2927,15 +2902,7 @@
     </w:p>
     <w:p>
       <w:r>
-        <w:t xml:space="preserve">Одним из перспективных направлений в данной области является применение открытого протокола OCPP 2.0.1 (Open </w:t>
-      </w:r>
-      <w:proofErr w:type="spellStart"/>
-      <w:r>
-        <w:t>Charge</w:t>
-      </w:r>
-      <w:proofErr w:type="spellEnd"/>
-      <w:r>
-        <w:t xml:space="preserve"> Point Protocol), обеспечивающего унифицированное взаимодействие между зарядной станцией и центральной системой управления (CSMS). Использование OCPP 2.0.1 позволяет реализовать удалённое управление зарядными сессиями, сбор статистики и расширяемость системы независимо от производителя оборудования.</w:t>
+        <w:t>Одним из перспективных направлений в данной области является применение открытого протокола OCPP 2.0.1 (Open Charge Point Protocol), обеспечивающего унифицированное взаимодействие между зарядной станцией и центральной системой управления (CSMS). Использование OCPP 2.0.1 позволяет реализовать удалённое управление зарядными сессиями, сбор статистики и расширяемость системы независимо от производителя оборудования.</w:t>
       </w:r>
     </w:p>
     <w:p>
@@ -3049,11 +3016,9 @@
       <w:r>
         <w:t xml:space="preserve">показ текущего статуса сессии и </w:t>
       </w:r>
-      <w:proofErr w:type="spellStart"/>
       <w:r>
         <w:t>коннетора</w:t>
       </w:r>
-      <w:proofErr w:type="spellEnd"/>
     </w:p>
     <w:p>
       <w:pPr>
@@ -3099,15 +3064,7 @@
         <w:t>и должен</w:t>
       </w:r>
       <w:r>
-        <w:t xml:space="preserve"> </w:t>
-      </w:r>
-      <w:proofErr w:type="spellStart"/>
-      <w:r>
-        <w:t>запускатся</w:t>
-      </w:r>
-      <w:proofErr w:type="spellEnd"/>
-      <w:r>
-        <w:t xml:space="preserve"> не более чем за три действия</w:t>
+        <w:t xml:space="preserve"> запускатся не более чем за три действия</w:t>
       </w:r>
     </w:p>
     <w:p>
@@ -3636,15 +3593,7 @@
         <w:t>для поддержания связи</w:t>
       </w:r>
       <w:r>
-        <w:t>(</w:t>
-      </w:r>
-      <w:proofErr w:type="spellStart"/>
-      <w:r>
-        <w:t>heartbeat</w:t>
-      </w:r>
-      <w:proofErr w:type="spellEnd"/>
-      <w:r>
-        <w:t>), передачу показаний счётчика электроэнергии и удалённые команды управления. Протокол позволяет интегрировать оборудование различных производителей в единую логику управления.</w:t>
+        <w:t>(heartbeat), передачу показаний счётчика электроэнергии и удалённые команды управления. Протокол позволяет интегрировать оборудование различных производителей в единую логику управления.</w:t>
       </w:r>
     </w:p>
     <w:p>
@@ -3691,15 +3640,7 @@
         <w:t>а</w:t>
       </w:r>
       <w:r>
-        <w:t xml:space="preserve"> </w:t>
-      </w:r>
-      <w:proofErr w:type="spellStart"/>
-      <w:r>
-        <w:t>heartbeat</w:t>
-      </w:r>
-      <w:proofErr w:type="spellEnd"/>
-      <w:r>
-        <w:t xml:space="preserve">-сообщений, отслеживание статуса </w:t>
+        <w:t xml:space="preserve"> heartbeat-сообщений, отслеживание статуса </w:t>
       </w:r>
       <w:r>
         <w:t>коннекторов</w:t>
@@ -3791,47 +3732,7 @@
     </w:p>
     <w:p>
       <w:r>
-        <w:t xml:space="preserve">Для выявления недостатков существующей организации управления домашней зарядной станцией выполнен сравнительный анализ российских решений: экосистем операторов зарядной инфраструктуры, </w:t>
-      </w:r>
-      <w:proofErr w:type="spellStart"/>
-      <w:r>
-        <w:t>вендорных</w:t>
-      </w:r>
-      <w:proofErr w:type="spellEnd"/>
-      <w:r>
-        <w:t xml:space="preserve"> приложений для домашних станций и облачных платформ управления ЭЗС (CSMS). В апреле 2026 г. операторский бизнес </w:t>
-      </w:r>
-      <w:proofErr w:type="spellStart"/>
-      <w:r>
-        <w:t>Sitronics</w:t>
-      </w:r>
-      <w:proofErr w:type="spellEnd"/>
-      <w:r>
-        <w:t xml:space="preserve"> </w:t>
-      </w:r>
-      <w:proofErr w:type="spellStart"/>
-      <w:r>
-        <w:t>Electro</w:t>
-      </w:r>
-      <w:proofErr w:type="spellEnd"/>
-      <w:r>
-        <w:t xml:space="preserve"> перешёл к </w:t>
-      </w:r>
-      <w:proofErr w:type="spellStart"/>
-      <w:r>
-        <w:t>Punkt</w:t>
-      </w:r>
-      <w:proofErr w:type="spellEnd"/>
-      <w:r>
-        <w:t xml:space="preserve"> E, поэтому соответствующие сервисы рассматриваются в составе экосистемы </w:t>
-      </w:r>
-      <w:proofErr w:type="spellStart"/>
-      <w:r>
-        <w:t>Punkt</w:t>
-      </w:r>
-      <w:proofErr w:type="spellEnd"/>
-      <w:r>
-        <w:t xml:space="preserve"> E.</w:t>
+        <w:t>Для выявления недостатков существующей организации управления домашней зарядной станцией выполнен сравнительный анализ российских решений: экосистем операторов зарядной инфраструктуры, вендорных приложений для домашних станций и облачных платформ управления ЭЗС (CSMS). В апреле 2026 г. операторский бизнес Sitronics Electro перешёл к Punkt E, поэтому соответствующие сервисы рассматриваются в составе экосистемы Punkt E.</w:t>
       </w:r>
       <w:r>
         <w:t xml:space="preserve"> [7]</w:t>
@@ -4113,55 +4014,29 @@
                 <w:lang w:val="en-US"/>
               </w:rPr>
             </w:pPr>
-            <w:proofErr w:type="spellStart"/>
             <w:r>
               <w:rPr>
                 <w:lang w:val="en-US"/>
               </w:rPr>
-              <w:t>Punkt</w:t>
-            </w:r>
-            <w:proofErr w:type="spellEnd"/>
-            <w:r>
-              <w:rPr>
-                <w:lang w:val="en-US"/>
-              </w:rPr>
-              <w:t xml:space="preserve"> E (</w:t>
-            </w:r>
-            <w:proofErr w:type="spellStart"/>
+              <w:t>Punkt E (</w:t>
+            </w:r>
             <w:r>
               <w:t>вкл</w:t>
             </w:r>
-            <w:proofErr w:type="spellEnd"/>
             <w:r>
               <w:rPr>
                 <w:lang w:val="en-US"/>
               </w:rPr>
               <w:t xml:space="preserve">. </w:t>
             </w:r>
-            <w:proofErr w:type="spellStart"/>
             <w:r>
               <w:t>бывш</w:t>
             </w:r>
-            <w:proofErr w:type="spellEnd"/>
             <w:r>
               <w:rPr>
                 <w:lang w:val="en-US"/>
               </w:rPr>
-              <w:t xml:space="preserve">. </w:t>
-            </w:r>
-            <w:proofErr w:type="spellStart"/>
-            <w:r>
-              <w:rPr>
-                <w:lang w:val="en-US"/>
-              </w:rPr>
-              <w:t>Sitronics</w:t>
-            </w:r>
-            <w:proofErr w:type="spellEnd"/>
-            <w:r>
-              <w:rPr>
-                <w:lang w:val="en-US"/>
-              </w:rPr>
-              <w:t xml:space="preserve"> Electro)</w:t>
+              <w:t>. Sitronics Electro)</w:t>
             </w:r>
           </w:p>
         </w:tc>
@@ -4203,15 +4078,7 @@
               <w:ind w:firstLine="0"/>
             </w:pPr>
             <w:r>
-              <w:t xml:space="preserve">В рамках экосистемы </w:t>
-            </w:r>
-            <w:proofErr w:type="spellStart"/>
-            <w:r>
-              <w:t>Punkt</w:t>
-            </w:r>
-            <w:proofErr w:type="spellEnd"/>
-            <w:r>
-              <w:t xml:space="preserve"> E</w:t>
+              <w:t>В рамках экосистемы Punkt E</w:t>
             </w:r>
           </w:p>
         </w:tc>
@@ -4377,11 +4244,9 @@
               <w:spacing w:line="240" w:lineRule="auto"/>
               <w:ind w:firstLine="0"/>
             </w:pPr>
-            <w:proofErr w:type="spellStart"/>
             <w:r>
               <w:t>Voltfuel</w:t>
             </w:r>
-            <w:proofErr w:type="spellEnd"/>
           </w:p>
         </w:tc>
         <w:tc>
@@ -4422,13 +4287,8 @@
               <w:ind w:firstLine="0"/>
             </w:pPr>
             <w:r>
-              <w:t xml:space="preserve">В рамках экосистемы </w:t>
-            </w:r>
-            <w:proofErr w:type="spellStart"/>
-            <w:r>
-              <w:t>Voltfuel</w:t>
-            </w:r>
-            <w:proofErr w:type="spellEnd"/>
+              <w:t>В рамках экосистемы Voltfuel</w:t>
+            </w:r>
           </w:p>
         </w:tc>
         <w:tc>
@@ -4571,13 +4431,8 @@
               <w:spacing w:line="240" w:lineRule="auto"/>
               <w:ind w:firstLine="0"/>
             </w:pPr>
-            <w:proofErr w:type="spellStart"/>
-            <w:r>
-              <w:t>Вендорное</w:t>
-            </w:r>
-            <w:proofErr w:type="spellEnd"/>
-            <w:r>
-              <w:t xml:space="preserve"> приложение к своим домашним станциям</w:t>
+            <w:r>
+              <w:t>Вендорное приложение к своим домашним станциям</w:t>
             </w:r>
           </w:p>
         </w:tc>
@@ -4653,15 +4508,7 @@
               <w:ind w:firstLine="0"/>
             </w:pPr>
             <w:r>
-              <w:t xml:space="preserve">Нет (управление и монетизация ЭЗС, </w:t>
-            </w:r>
-            <w:proofErr w:type="spellStart"/>
-            <w:r>
-              <w:t>SaaS</w:t>
-            </w:r>
-            <w:proofErr w:type="spellEnd"/>
-            <w:r>
-              <w:t>)</w:t>
+              <w:t>Нет (управление и монетизация ЭЗС, SaaS)</w:t>
             </w:r>
           </w:p>
         </w:tc>
@@ -4743,15 +4590,7 @@
     </w:p>
     <w:p>
       <w:r>
-        <w:t xml:space="preserve">Доминирование операторского и коммерческого контура. </w:t>
-      </w:r>
-      <w:proofErr w:type="spellStart"/>
-      <w:r>
-        <w:t>Punkt</w:t>
-      </w:r>
-      <w:proofErr w:type="spellEnd"/>
-      <w:r>
-        <w:t xml:space="preserve"> E</w:t>
+        <w:t>Доминирование операторского и коммерческого контура. Punkt E</w:t>
       </w:r>
       <w:r>
         <w:t xml:space="preserve"> </w:t>
@@ -4766,13 +4605,8 @@
         <w:t xml:space="preserve"> [8]</w:t>
       </w:r>
       <w:r>
-        <w:t xml:space="preserve">, </w:t>
-      </w:r>
-      <w:proofErr w:type="spellStart"/>
-      <w:r>
-        <w:t>Voltfuel</w:t>
-      </w:r>
-      <w:proofErr w:type="spellEnd"/>
+        <w:t>, Voltfuel</w:t>
+      </w:r>
       <w:r>
         <w:t xml:space="preserve"> [10]</w:t>
       </w:r>
@@ -4874,15 +4708,7 @@
     </w:p>
     <w:p>
       <w:r>
-        <w:t>По данным агентства «</w:t>
-      </w:r>
-      <w:proofErr w:type="spellStart"/>
-      <w:r>
-        <w:t>Автостат</w:t>
-      </w:r>
-      <w:proofErr w:type="spellEnd"/>
-      <w:r>
-        <w:t xml:space="preserve">», на 1 июля 2026 года парк электромобилей и подключаемых гибридов в России составлял около 230 тыс. </w:t>
+        <w:t xml:space="preserve">По данным агентства «Автостат», на 1 июля 2026 года парк электромобилей и подключаемых гибридов в России составлял около 230 тыс. </w:t>
       </w:r>
       <w:r>
         <w:lastRenderedPageBreak/>
@@ -4970,23 +4796,7 @@
         <w:t>не полностью</w:t>
       </w:r>
       <w:r>
-        <w:t xml:space="preserve">. Подключение к серверу </w:t>
-      </w:r>
-      <w:proofErr w:type="spellStart"/>
-      <w:r>
-        <w:t>Punkt</w:t>
-      </w:r>
-      <w:proofErr w:type="spellEnd"/>
-      <w:r>
-        <w:t xml:space="preserve"> E, ZEVS, </w:t>
-      </w:r>
-      <w:proofErr w:type="spellStart"/>
-      <w:r>
-        <w:t>Voltfuel</w:t>
-      </w:r>
-      <w:proofErr w:type="spellEnd"/>
-      <w:r>
-        <w:t xml:space="preserve"> или EV-Time даёт удалённый доступ, но добавляет контур тарифов и монетизации, который для персональной домашней станции избыточен. Приложение ПСС сокращает действия только для станций этого производителя и не позволяет подключить произвольную станцию по протоколу OCPP 2.0.1.</w:t>
+        <w:t>. Подключение к серверу Punkt E, ZEVS, Voltfuel или EV-Time даёт удалённый доступ, но добавляет контур тарифов и монетизации, который для персональной домашней станции избыточен. Приложение ПСС сокращает действия только для станций этого производителя и не позволяет подключить произвольную станцию по протоколу OCPP 2.0.1.</w:t>
       </w:r>
     </w:p>
     <w:p>
@@ -5722,13 +5532,8 @@
         <w:t>. После указания адреса сервера станция с поддержкой OCPP 2.0.1 подключается к системе и появляется в списке станций пользователя</w:t>
       </w:r>
       <w:r>
-        <w:t xml:space="preserve">, а </w:t>
-      </w:r>
-      <w:proofErr w:type="gramStart"/>
-      <w:r>
-        <w:t>так же</w:t>
-      </w:r>
-      <w:proofErr w:type="gramEnd"/>
+        <w:t>, а так же</w:t>
+      </w:r>
       <w:r>
         <w:t>,</w:t>
       </w:r>
@@ -7009,13 +6814,8 @@
         </w:numPr>
       </w:pPr>
       <w:r>
-        <w:t xml:space="preserve">учётная запись: адрес электронной почты и пароль в виде </w:t>
-      </w:r>
-      <w:proofErr w:type="spellStart"/>
-      <w:r>
-        <w:t>хеша</w:t>
-      </w:r>
-      <w:proofErr w:type="spellEnd"/>
+        <w:t>учётная запись: адрес электронной почты и пароль в виде хеша</w:t>
+      </w:r>
     </w:p>
     <w:p>
       <w:pPr>
@@ -7056,15 +6856,7 @@
     <w:p>
       <w:r>
         <w:lastRenderedPageBreak/>
-        <w:t xml:space="preserve">Сообщения станции по протоколу OCPP 2.0.1 должны </w:t>
-      </w:r>
-      <w:proofErr w:type="spellStart"/>
-      <w:r>
-        <w:t>журналироваться</w:t>
-      </w:r>
-      <w:proofErr w:type="spellEnd"/>
-      <w:r>
-        <w:t xml:space="preserve"> отдельно от истории сессий, чтобы по ним можно было разобрать отказ запуска.</w:t>
+        <w:t>Сообщения станции по протоколу OCPP 2.0.1 должны журналироваться отдельно от истории сессий, чтобы по ним можно было разобрать отказ запуска.</w:t>
       </w:r>
     </w:p>
     <w:p>
@@ -7654,7 +7446,19 @@
         <w:t xml:space="preserve">. Пока сессия не завершена, </w:t>
       </w:r>
       <w:r>
-        <w:t>данная сессия считается текущей у пользователя может быть только одна текущая сессия</w:t>
+        <w:t>данная сессия считается текущей</w:t>
+      </w:r>
+      <w:r>
+        <w:t xml:space="preserve">, </w:t>
+      </w:r>
+      <w:r>
+        <w:t xml:space="preserve">у </w:t>
+      </w:r>
+      <w:r>
+        <w:t>станции</w:t>
+      </w:r>
+      <w:r>
+        <w:t xml:space="preserve"> может быть только одна текущая сессия</w:t>
       </w:r>
       <w:r>
         <w:t>.</w:t>
@@ -7798,15 +7602,7 @@
         <w:t xml:space="preserve"> протокола</w:t>
       </w:r>
       <w:r>
-        <w:t xml:space="preserve"> </w:t>
-      </w:r>
-      <w:proofErr w:type="spellStart"/>
-      <w:r>
-        <w:t>WebSocket</w:t>
-      </w:r>
-      <w:proofErr w:type="spellEnd"/>
-      <w:r>
-        <w:t xml:space="preserve">. </w:t>
+        <w:t xml:space="preserve"> WebSocket. </w:t>
       </w:r>
       <w:r>
         <w:t>Для функций таблицы 2.1 достаточно операций из таблицы 2.2.</w:t>
@@ -7885,11 +7681,9 @@
               <w:spacing w:line="240" w:lineRule="auto"/>
               <w:ind w:firstLine="0"/>
             </w:pPr>
-            <w:proofErr w:type="spellStart"/>
             <w:r>
               <w:t>BootNotification</w:t>
             </w:r>
-            <w:proofErr w:type="spellEnd"/>
           </w:p>
         </w:tc>
         <w:tc>
@@ -7940,11 +7734,9 @@
               <w:spacing w:line="240" w:lineRule="auto"/>
               <w:ind w:firstLine="0"/>
             </w:pPr>
-            <w:proofErr w:type="spellStart"/>
             <w:r>
               <w:t>Heartbeat</w:t>
             </w:r>
-            <w:proofErr w:type="spellEnd"/>
           </w:p>
         </w:tc>
         <w:tc>
@@ -7995,11 +7787,9 @@
               <w:spacing w:line="240" w:lineRule="auto"/>
               <w:ind w:firstLine="0"/>
             </w:pPr>
-            <w:proofErr w:type="spellStart"/>
             <w:r>
               <w:t>StatusNotification</w:t>
             </w:r>
-            <w:proofErr w:type="spellEnd"/>
           </w:p>
         </w:tc>
         <w:tc>
@@ -8050,11 +7840,9 @@
               <w:spacing w:line="240" w:lineRule="auto"/>
               <w:ind w:firstLine="0"/>
             </w:pPr>
-            <w:proofErr w:type="spellStart"/>
             <w:r>
               <w:t>RequestStartTransaction</w:t>
             </w:r>
-            <w:proofErr w:type="spellEnd"/>
           </w:p>
         </w:tc>
         <w:tc>
@@ -8108,11 +7896,9 @@
               <w:spacing w:line="240" w:lineRule="auto"/>
               <w:ind w:firstLine="0"/>
             </w:pPr>
-            <w:proofErr w:type="spellStart"/>
             <w:r>
               <w:t>RequestStopTransaction</w:t>
             </w:r>
-            <w:proofErr w:type="spellEnd"/>
           </w:p>
         </w:tc>
         <w:tc>
@@ -8166,11 +7952,9 @@
               <w:spacing w:line="240" w:lineRule="auto"/>
               <w:ind w:firstLine="0"/>
             </w:pPr>
-            <w:proofErr w:type="spellStart"/>
             <w:r>
               <w:t>TransactionEvent</w:t>
             </w:r>
-            <w:proofErr w:type="spellEnd"/>
           </w:p>
         </w:tc>
         <w:tc>
@@ -8240,127 +8024,60 @@
         <w:rPr>
           <w:lang w:val="en-US"/>
         </w:rPr>
+        <w:t xml:space="preserve"> RequestStartTransaction </w:t>
+      </w:r>
+      <w:r>
+        <w:t>и</w:t>
+      </w:r>
+      <w:r>
+        <w:rPr>
+          <w:lang w:val="en-US"/>
+        </w:rPr>
+        <w:t xml:space="preserve"> RequestStopTransaction </w:t>
+      </w:r>
+      <w:r>
+        <w:t>бывает</w:t>
+      </w:r>
+      <w:r>
+        <w:rPr>
+          <w:lang w:val="en-US"/>
+        </w:rPr>
+        <w:t xml:space="preserve"> Accepted </w:t>
+      </w:r>
+      <w:r>
+        <w:t>или</w:t>
+      </w:r>
+      <w:r>
+        <w:rPr>
+          <w:lang w:val="en-US"/>
+        </w:rPr>
+        <w:t xml:space="preserve"> Rejected. </w:t>
+      </w:r>
+      <w:r>
+        <w:t>Ход и завершение сессии сервер определяет не по этому ответу, а по сообщению TransactionEvent</w:t>
+      </w:r>
+      <w:r>
+        <w:t>,</w:t>
+      </w:r>
+      <w:r>
+        <w:t xml:space="preserve"> с типами</w:t>
+      </w:r>
+      <w:r>
+        <w:t xml:space="preserve"> Started</w:t>
+      </w:r>
+      <w:r>
         <w:t xml:space="preserve"> </w:t>
       </w:r>
-      <w:proofErr w:type="spellStart"/>
-      <w:r>
-        <w:rPr>
-          <w:lang w:val="en-US"/>
-        </w:rPr>
-        <w:t>RequestStartTransaction</w:t>
-      </w:r>
-      <w:proofErr w:type="spellEnd"/>
-      <w:r>
-        <w:rPr>
-          <w:lang w:val="en-US"/>
-        </w:rPr>
-        <w:t xml:space="preserve"> </w:t>
-      </w:r>
-      <w:r>
-        <w:t>и</w:t>
-      </w:r>
-      <w:r>
-        <w:rPr>
-          <w:lang w:val="en-US"/>
-        </w:rPr>
-        <w:t xml:space="preserve"> </w:t>
-      </w:r>
-      <w:proofErr w:type="spellStart"/>
-      <w:r>
-        <w:rPr>
-          <w:lang w:val="en-US"/>
-        </w:rPr>
-        <w:t>RequestStopTransaction</w:t>
-      </w:r>
-      <w:proofErr w:type="spellEnd"/>
-      <w:r>
-        <w:rPr>
-          <w:lang w:val="en-US"/>
-        </w:rPr>
-        <w:t xml:space="preserve"> </w:t>
-      </w:r>
-      <w:r>
-        <w:t>бывает</w:t>
-      </w:r>
-      <w:r>
-        <w:rPr>
-          <w:lang w:val="en-US"/>
-        </w:rPr>
-        <w:t xml:space="preserve"> Accepted </w:t>
-      </w:r>
-      <w:r>
-        <w:t>или</w:t>
-      </w:r>
-      <w:r>
-        <w:rPr>
-          <w:lang w:val="en-US"/>
-        </w:rPr>
-        <w:t xml:space="preserve"> Rejected. </w:t>
-      </w:r>
-      <w:r>
-        <w:t xml:space="preserve">Ход и завершение сессии сервер определяет не по этому ответу, а по сообщению </w:t>
-      </w:r>
-      <w:proofErr w:type="spellStart"/>
-      <w:r>
-        <w:t>TransactionEvent</w:t>
-      </w:r>
-      <w:proofErr w:type="spellEnd"/>
-      <w:r>
-        <w:t>,</w:t>
-      </w:r>
-      <w:r>
-        <w:t xml:space="preserve"> с типами</w:t>
-      </w:r>
-      <w:r>
-        <w:t xml:space="preserve"> </w:t>
-      </w:r>
-      <w:proofErr w:type="spellStart"/>
-      <w:r>
-        <w:t>Started</w:t>
-      </w:r>
-      <w:proofErr w:type="spellEnd"/>
-      <w:r>
-        <w:t xml:space="preserve"> </w:t>
-      </w:r>
       <w:r>
         <w:t xml:space="preserve">или </w:t>
       </w:r>
-      <w:proofErr w:type="spellStart"/>
-      <w:r>
-        <w:t>Ended</w:t>
-      </w:r>
-      <w:proofErr w:type="spellEnd"/>
-      <w:r>
-        <w:t>.</w:t>
-      </w:r>
-    </w:p>
-    <w:p>
-      <w:r>
-        <w:t xml:space="preserve">Для привязки станции, пользователь в приложении получает адрес сервера, в котором уже есть признак его учётной записи, и вводит этот адрес на станции. Станция открывает соединение и отправляет </w:t>
-      </w:r>
-      <w:proofErr w:type="spellStart"/>
-      <w:r>
-        <w:t>BootNotification</w:t>
-      </w:r>
-      <w:proofErr w:type="spellEnd"/>
-      <w:r>
-        <w:t xml:space="preserve">. Сервер принимает станцию и связывает её с учётной записью, которой принадлежал адрес. После чего станция направляет </w:t>
-      </w:r>
-      <w:proofErr w:type="spellStart"/>
-      <w:r>
-        <w:t>StatusNotification</w:t>
-      </w:r>
-      <w:proofErr w:type="spellEnd"/>
-      <w:r>
-        <w:t xml:space="preserve"> для каждого коннектора. В результате станция и список коннекторов появляются у пользователя. Если </w:t>
-      </w:r>
-      <w:proofErr w:type="spellStart"/>
-      <w:r>
-        <w:t>BootNotification</w:t>
-      </w:r>
-      <w:proofErr w:type="spellEnd"/>
-      <w:r>
-        <w:t xml:space="preserve"> не пришло, станция в список не добавляется.</w:t>
+      <w:r>
+        <w:t>Ended.</w:t>
+      </w:r>
+    </w:p>
+    <w:p>
+      <w:r>
+        <w:t>Для привязки станции, пользователь в приложении получает адрес сервера, в котором уже есть признак его учётной записи, и вводит этот адрес на станции. Станция открывает соединение и отправляет BootNotification. Сервер принимает станцию и связывает её с учётной записью, которой принадлежал адрес. После чего станция направляет StatusNotification для каждого коннектора. В результате станция и список коннекторов появляются у пользователя. Если BootNotification не пришло, станция в список не добавляется.</w:t>
       </w:r>
       <w:r>
         <w:t xml:space="preserve"> </w:t>
@@ -8456,49 +8173,29 @@
     </w:p>
     <w:p>
       <w:r>
-        <w:t xml:space="preserve">Для запуска сессии необходимо из приложения отправить команду «Старт» на сервер, после чего он проверяет что у пользователя нет текущей сессии и отправляет станции </w:t>
-      </w:r>
-      <w:proofErr w:type="spellStart"/>
-      <w:r>
-        <w:t>RequestStartTransaction</w:t>
-      </w:r>
-      <w:proofErr w:type="spellEnd"/>
-      <w:r>
-        <w:t xml:space="preserve">. Если станция недоступна или ответила </w:t>
-      </w:r>
-      <w:proofErr w:type="spellStart"/>
-      <w:r>
-        <w:t>Rejected</w:t>
-      </w:r>
-      <w:proofErr w:type="spellEnd"/>
-      <w:r>
-        <w:t xml:space="preserve">, сессия не создаётся, пользователь видит ошибку. Если </w:t>
+        <w:t>Для запуска сессии необходимо из приложения отправить команду «Старт» на сервер, после чего он проверяет</w:t>
+      </w:r>
+      <w:r>
+        <w:t>,</w:t>
+      </w:r>
+      <w:r>
+        <w:t xml:space="preserve"> что у </w:t>
+      </w:r>
+      <w:r>
+        <w:t>выбранной станции</w:t>
+      </w:r>
+      <w:r>
+        <w:t xml:space="preserve"> нет текущей сессии и отправляет станции RequestStartTransaction. Если станция недоступна или ответила Rejected, сессия не создаётся, пользователь видит </w:t>
       </w:r>
       <w:r>
         <w:lastRenderedPageBreak/>
-        <w:t xml:space="preserve">станция ответила </w:t>
-      </w:r>
-      <w:proofErr w:type="spellStart"/>
-      <w:r>
-        <w:t>Accepted</w:t>
-      </w:r>
-      <w:proofErr w:type="spellEnd"/>
-      <w:r>
-        <w:t>, текущая сессия создаётся</w:t>
+        <w:t>ошибку. Если станция ответила Accepted, текущая сессия создаётся</w:t>
       </w:r>
       <w:r>
         <w:t>, с пустыми значениями полей, время старта и начального значения счетчика</w:t>
       </w:r>
       <w:r>
-        <w:t xml:space="preserve">, данные поля заполняются по сообщению </w:t>
-      </w:r>
-      <w:proofErr w:type="spellStart"/>
-      <w:r>
-        <w:t>TransactionEvent</w:t>
-      </w:r>
-      <w:proofErr w:type="spellEnd"/>
-      <w:r>
-        <w:t xml:space="preserve"> с типом </w:t>
+        <w:t xml:space="preserve">, данные поля заполняются по сообщению TransactionEvent с типом </w:t>
       </w:r>
       <w:r>
         <w:rPr>
@@ -8507,23 +8204,7 @@
         <w:t>Started</w:t>
       </w:r>
       <w:r>
-        <w:t xml:space="preserve">. Во время сессии станция присылает </w:t>
-      </w:r>
-      <w:proofErr w:type="spellStart"/>
-      <w:r>
-        <w:t>TransactionEvent</w:t>
-      </w:r>
-      <w:proofErr w:type="spellEnd"/>
-      <w:r>
-        <w:t xml:space="preserve"> с типом </w:t>
-      </w:r>
-      <w:proofErr w:type="spellStart"/>
-      <w:r>
-        <w:t>Updated</w:t>
-      </w:r>
-      <w:proofErr w:type="spellEnd"/>
-      <w:r>
-        <w:t xml:space="preserve"> и показания. Эти данные сервер </w:t>
+        <w:t xml:space="preserve">. Во время сессии станция присылает TransactionEvent с типом Updated и показания. Эти данные сервер </w:t>
       </w:r>
       <w:r>
         <w:t>записывает в сессию как последнее значение и отправляет в мобильное приложение</w:t>
@@ -8540,45 +8221,13 @@
         <w:t xml:space="preserve"> из приложения,</w:t>
       </w:r>
       <w:r>
-        <w:t xml:space="preserve"> сервер отправляет </w:t>
-      </w:r>
-      <w:proofErr w:type="spellStart"/>
-      <w:r>
-        <w:t>RequestStopTransaction</w:t>
-      </w:r>
-      <w:proofErr w:type="spellEnd"/>
-      <w:r>
-        <w:t xml:space="preserve">. Сессия остаётся текущей, пока станция не пришлёт </w:t>
-      </w:r>
-      <w:proofErr w:type="spellStart"/>
-      <w:r>
-        <w:t>TransactionEvent</w:t>
-      </w:r>
-      <w:proofErr w:type="spellEnd"/>
-      <w:r>
-        <w:t xml:space="preserve"> с типом </w:t>
-      </w:r>
-      <w:proofErr w:type="spellStart"/>
-      <w:r>
-        <w:t>Ended</w:t>
-      </w:r>
-      <w:proofErr w:type="spellEnd"/>
-      <w:r>
-        <w:t xml:space="preserve">. </w:t>
+        <w:t xml:space="preserve"> сервер отправляет RequestStopTransaction. Сессия остаётся текущей, пока станция не пришлёт TransactionEvent с типом Ended. </w:t>
       </w:r>
       <w:r>
         <w:t>Так же станция может завершить сессию самостоятельно, отправив такое же сообщение на сервер</w:t>
       </w:r>
       <w:r>
-        <w:t xml:space="preserve">. При </w:t>
-      </w:r>
-      <w:proofErr w:type="spellStart"/>
-      <w:r>
-        <w:t>Ended</w:t>
-      </w:r>
-      <w:proofErr w:type="spellEnd"/>
-      <w:r>
-        <w:t xml:space="preserve"> сервер</w:t>
+        <w:t>. При Ended сервер</w:t>
       </w:r>
       <w:r>
         <w:t xml:space="preserve"> помечает текущую сессию как завершенную и подсистема истории сеансов отображает ее как завершенную</w:t>
@@ -8668,267 +8317,242 @@
     </w:p>
     <w:p>
       <w:r>
-        <w:t xml:space="preserve">Контроль связи. Пока станция подключена, она периодически отправляет </w:t>
-      </w:r>
-      <w:proofErr w:type="spellStart"/>
-      <w:r>
+        <w:t>Контроль связи. Пока станция подключена, она периодически отправляет Heartbeat</w:t>
+      </w:r>
+      <w:r>
+        <w:t>, для поддержания активного соединения</w:t>
+      </w:r>
+      <w:r>
+        <w:t xml:space="preserve">. Если </w:t>
+      </w:r>
+      <w:r>
+        <w:t xml:space="preserve">произошел разрыв по протоколу </w:t>
+      </w:r>
+      <w:r>
+        <w:rPr>
+          <w:lang w:val="en-US"/>
+        </w:rPr>
+        <w:t>WebSocket</w:t>
+      </w:r>
+      <w:r>
+        <w:t xml:space="preserve">, сервер помечает станцию как недоступную и показывает это в приложении. </w:t>
+      </w:r>
+      <w:r>
+        <w:t>Начать новую сессию для такой станции невозможно</w:t>
+      </w:r>
+      <w:r>
+        <w:t>.</w:t>
+      </w:r>
+    </w:p>
+    <w:p/>
+    <w:p>
+      <w:pPr>
+        <w:pStyle w:val="2"/>
+      </w:pPr>
+      <w:bookmarkStart w:id="38" w:name="_Toc242914549"/>
+      <w:r>
+        <w:t>2.7 Информационная модель и структура данных</w:t>
+      </w:r>
+      <w:bookmarkEnd w:id="38"/>
+    </w:p>
+    <w:p>
+      <w:r>
+        <w:t xml:space="preserve">В базе сервера хранятся учётные записи, станции, коннекторы и сессии. Журнал сообщений </w:t>
+      </w:r>
+      <w:r>
+        <w:rPr>
+          <w:lang w:val="en-US"/>
+        </w:rPr>
+        <w:t>OCPP</w:t>
+      </w:r>
+      <w:r>
+        <w:t xml:space="preserve"> 2.0.1 к этим данным не относится и ведётся отдельно</w:t>
+      </w:r>
+      <w:r>
+        <w:t>, он необходим для разбора ошибок при общении станции и сервера</w:t>
+      </w:r>
+      <w:r>
+        <w:t>.</w:t>
+      </w:r>
+    </w:p>
+    <w:p>
+      <w:r>
+        <w:t>Учётная запись содержит адрес электронной почты, хеш</w:t>
+      </w:r>
+      <w:r>
+        <w:t>ированный</w:t>
+      </w:r>
+      <w:r>
+        <w:t xml:space="preserve"> парол</w:t>
+      </w:r>
+      <w:r>
+        <w:t>ь</w:t>
+      </w:r>
+      <w:r>
+        <w:t xml:space="preserve">, признак согласия на обработку данных и признак блокировки. Адрес электронной почты уникален. </w:t>
+      </w:r>
+      <w:r>
+        <w:t>Д</w:t>
+      </w:r>
+      <w:r>
+        <w:t>ругие сведения о личности не хранятся.</w:t>
+      </w:r>
+    </w:p>
+    <w:p>
+      <w:r>
+        <w:t xml:space="preserve">Станция принадлежит одной учётной записи. У неё есть идентификатор, полученный в </w:t>
+      </w:r>
+      <w:r>
+        <w:rPr>
+          <w:lang w:val="en-US"/>
+        </w:rPr>
+        <w:t>BootNotification</w:t>
+      </w:r>
+      <w:r>
+        <w:t xml:space="preserve"> и </w:t>
+      </w:r>
+      <w:r>
+        <w:t>статус состояния станции</w:t>
+      </w:r>
+      <w:r>
+        <w:t>. Станция доступна</w:t>
+      </w:r>
+      <w:r>
+        <w:t xml:space="preserve"> в разрешенных состояниях и есть прямое соединение</w:t>
+      </w:r>
+      <w:r>
+        <w:t>. Если сетевая активность прекратилась,</w:t>
+      </w:r>
+      <w:r>
+        <w:t xml:space="preserve"> например</w:t>
+      </w:r>
+      <w:r>
+        <w:t xml:space="preserve"> соединение разрывается по таймауту, </w:t>
+      </w:r>
+      <w:r>
+        <w:t xml:space="preserve">тогда </w:t>
+      </w:r>
+      <w:r>
+        <w:t xml:space="preserve">станция становится недоступной до следующего </w:t>
+      </w:r>
+      <w:r>
+        <w:rPr>
+          <w:lang w:val="en-US"/>
+        </w:rPr>
+        <w:t>BootNotification</w:t>
+      </w:r>
+      <w:r>
+        <w:t xml:space="preserve">. Сообщение </w:t>
+      </w:r>
+      <w:r>
+        <w:rPr>
+          <w:lang w:val="en-US"/>
+        </w:rPr>
         <w:t>Heartbeat</w:t>
       </w:r>
-      <w:proofErr w:type="spellEnd"/>
-      <w:r>
-        <w:t>, для поддержания активного соединения</w:t>
-      </w:r>
-      <w:r>
-        <w:t xml:space="preserve">. Если </w:t>
-      </w:r>
-      <w:r>
-        <w:t xml:space="preserve">произошел разрыв по протоколу </w:t>
+      <w:r>
+        <w:t xml:space="preserve"> этот признак не меняет</w:t>
+      </w:r>
+      <w:r>
+        <w:t>.</w:t>
+      </w:r>
+    </w:p>
+    <w:p>
+      <w:r>
+        <w:t xml:space="preserve">У одной станции несколько коннекторов. У коннектора хранятся его номер на станции и последний статус из </w:t>
       </w:r>
       <w:r>
         <w:rPr>
           <w:lang w:val="en-US"/>
         </w:rPr>
-        <w:t>WebSocket</w:t>
-      </w:r>
-      <w:r>
-        <w:t xml:space="preserve">, сервер помечает станцию как недоступную и показывает это в приложении. </w:t>
-      </w:r>
-      <w:r>
-        <w:t>Начать новую сессию для такой станции невозможно</w:t>
+        <w:t>StatusNotification</w:t>
       </w:r>
       <w:r>
         <w:t>.</w:t>
       </w:r>
     </w:p>
-    <w:p/>
-    <w:p>
-      <w:pPr>
-        <w:pStyle w:val="2"/>
-      </w:pPr>
-      <w:bookmarkStart w:id="38" w:name="_Toc242914549"/>
-      <w:r>
-        <w:t>2.7 Информационная модель и структура данных</w:t>
-      </w:r>
-      <w:bookmarkEnd w:id="38"/>
-    </w:p>
-    <w:p>
-      <w:r>
-        <w:t xml:space="preserve">В базе сервера хранятся учётные записи, станции, коннекторы и сессии. Журнал сообщений </w:t>
+    <w:p>
+      <w:r>
+        <w:t xml:space="preserve">Сессия принадлежит одной учётной записи, одной станции и одному коннектору. У неё есть идентификатор транзакции, время начала, время окончания, </w:t>
+      </w:r>
+      <w:r>
+        <w:t>начальное и конечное значения счетчика энерги</w:t>
+      </w:r>
+      <w:r>
+        <w:t>и</w:t>
+      </w:r>
+      <w:r>
+        <w:t>.</w:t>
+      </w:r>
+      <w:r>
+        <w:t xml:space="preserve"> </w:t>
+      </w:r>
+      <w:r>
+        <w:t xml:space="preserve">У </w:t>
+      </w:r>
+      <w:r>
+        <w:t xml:space="preserve">станции </w:t>
+      </w:r>
+      <w:r>
+        <w:t xml:space="preserve">не больше одной сессии в </w:t>
+      </w:r>
+      <w:r>
+        <w:t>состоянии</w:t>
+      </w:r>
+      <w:r>
+        <w:t xml:space="preserve"> «текущая»</w:t>
+      </w:r>
+      <w:r>
+        <w:t>, данное состояние определяется</w:t>
+      </w:r>
+      <w:r>
+        <w:t xml:space="preserve"> по нескольким полям, отдельного поля для этого </w:t>
+      </w:r>
+      <w:r>
+        <w:t xml:space="preserve">состояния </w:t>
+      </w:r>
+      <w:r>
+        <w:t>нет</w:t>
+      </w:r>
+      <w:r>
+        <w:t xml:space="preserve">. Если у сессии есть время старта </w:t>
+      </w:r>
+      <w:r>
+        <w:t>зарядки,</w:t>
+      </w:r>
+      <w:r>
+        <w:t xml:space="preserve"> но нет конечного</w:t>
+      </w:r>
+      <w:r>
+        <w:t>, значит она началась</w:t>
+      </w:r>
+      <w:r>
+        <w:t xml:space="preserve"> и является текущей</w:t>
+      </w:r>
+      <w:r>
+        <w:t>, если у нее есть время завершения, то она значит завершённая.</w:t>
+      </w:r>
+      <w:r>
+        <w:t xml:space="preserve"> </w:t>
+      </w:r>
+    </w:p>
+    <w:p>
+      <w:r>
+        <w:lastRenderedPageBreak/>
+        <w:t>По сообщению TransactionEvent с типом Started в уже созданную сессию записываются время старта и начальное значение счётчика энергии</w:t>
+      </w:r>
+      <w:r>
+        <w:t xml:space="preserve">. </w:t>
+      </w:r>
+      <w:r>
+        <w:t xml:space="preserve">Сообщение </w:t>
       </w:r>
       <w:r>
         <w:rPr>
           <w:lang w:val="en-US"/>
         </w:rPr>
-        <w:t>OCPP</w:t>
-      </w:r>
-      <w:r>
-        <w:t xml:space="preserve"> 2.0.1 к этим данным не относится и ведётся отдельно</w:t>
-      </w:r>
-      <w:r>
-        <w:t>, он необходим для разбора ошибок при общении станции и сервера</w:t>
-      </w:r>
-      <w:r>
-        <w:t>.</w:t>
-      </w:r>
-    </w:p>
-    <w:p>
-      <w:r>
-        <w:t>Учётная запись содержит адрес электронной почты, хеш</w:t>
-      </w:r>
-      <w:r>
-        <w:t>ированный</w:t>
-      </w:r>
-      <w:r>
-        <w:t xml:space="preserve"> парол</w:t>
-      </w:r>
-      <w:r>
-        <w:t>ь</w:t>
-      </w:r>
-      <w:r>
-        <w:t xml:space="preserve">, признак согласия на обработку данных и признак блокировки. Адрес электронной почты уникален. </w:t>
-      </w:r>
-      <w:r>
-        <w:t>Д</w:t>
-      </w:r>
-      <w:r>
-        <w:t>ругие сведения о личности не хранятся.</w:t>
-      </w:r>
-    </w:p>
-    <w:p>
-      <w:r>
-        <w:t xml:space="preserve">Станция принадлежит одной учётной записи. У неё есть идентификатор, полученный в </w:t>
-      </w:r>
-      <w:proofErr w:type="spellStart"/>
-      <w:r>
-        <w:rPr>
-          <w:lang w:val="en-US"/>
-        </w:rPr>
-        <w:t>BootNotification</w:t>
-      </w:r>
-      <w:proofErr w:type="spellEnd"/>
-      <w:r>
-        <w:t xml:space="preserve"> и </w:t>
-      </w:r>
-      <w:r>
-        <w:t>статус состояния станции</w:t>
-      </w:r>
-      <w:r>
-        <w:t>. Станция доступна</w:t>
-      </w:r>
-      <w:r>
-        <w:t xml:space="preserve"> в разрешенных состояниях и есть прямое соединение</w:t>
-      </w:r>
-      <w:r>
-        <w:t>. Если сетевая активность прекратилась,</w:t>
-      </w:r>
-      <w:r>
-        <w:t xml:space="preserve"> например</w:t>
-      </w:r>
-      <w:r>
-        <w:t xml:space="preserve"> соединение разрывается по таймауту, </w:t>
-      </w:r>
-      <w:r>
-        <w:t xml:space="preserve">тогда </w:t>
-      </w:r>
-      <w:r>
-        <w:t xml:space="preserve">станция становится недоступной до следующего </w:t>
-      </w:r>
-      <w:proofErr w:type="spellStart"/>
-      <w:r>
-        <w:rPr>
-          <w:lang w:val="en-US"/>
-        </w:rPr>
-        <w:t>BootNotification</w:t>
-      </w:r>
-      <w:proofErr w:type="spellEnd"/>
-      <w:r>
-        <w:t xml:space="preserve">. Сообщение </w:t>
-      </w:r>
-      <w:r>
-        <w:rPr>
-          <w:lang w:val="en-US"/>
-        </w:rPr>
-        <w:t>Heartbeat</w:t>
-      </w:r>
-      <w:r>
-        <w:t xml:space="preserve"> этот признак не меняет</w:t>
-      </w:r>
-      <w:r>
-        <w:t>.</w:t>
-      </w:r>
-    </w:p>
-    <w:p>
-      <w:r>
-        <w:t xml:space="preserve">У одной станции несколько коннекторов. У коннектора хранятся его номер на станции и последний статус из </w:t>
-      </w:r>
-      <w:proofErr w:type="spellStart"/>
-      <w:r>
-        <w:rPr>
-          <w:lang w:val="en-US"/>
-        </w:rPr>
-        <w:t>StatusNotification</w:t>
-      </w:r>
-      <w:proofErr w:type="spellEnd"/>
-      <w:r>
-        <w:t>.</w:t>
-      </w:r>
-    </w:p>
-    <w:p>
-      <w:r>
-        <w:t xml:space="preserve">Сессия принадлежит одной учётной записи, одной станции и одному коннектору. У неё есть идентификатор транзакции, время начала, время окончания, </w:t>
-      </w:r>
-      <w:r>
-        <w:t xml:space="preserve">начальное и конечное значения счетчика </w:t>
-      </w:r>
-      <w:proofErr w:type="spellStart"/>
-      <w:r>
-        <w:t>энерги</w:t>
-      </w:r>
-      <w:proofErr w:type="spellEnd"/>
-      <w:r>
-        <w:t>.</w:t>
-      </w:r>
-      <w:r>
-        <w:t xml:space="preserve"> </w:t>
-      </w:r>
-      <w:r>
-        <w:t xml:space="preserve">У пользователя не больше одной сессии в </w:t>
-      </w:r>
-      <w:r>
-        <w:t>состоянии</w:t>
-      </w:r>
-      <w:r>
-        <w:t xml:space="preserve"> «текущая»</w:t>
-      </w:r>
-      <w:r>
-        <w:t>, данное состояние определяется</w:t>
-      </w:r>
-      <w:r>
-        <w:t xml:space="preserve"> по нескольким полям, отдельного поля для этого </w:t>
-      </w:r>
-      <w:r>
-        <w:t xml:space="preserve">состояния </w:t>
-      </w:r>
-      <w:r>
-        <w:t>нет</w:t>
-      </w:r>
-      <w:r>
-        <w:t xml:space="preserve">. Если у сессии есть время старта </w:t>
-      </w:r>
-      <w:r>
-        <w:t>зарядки,</w:t>
-      </w:r>
-      <w:r>
-        <w:t xml:space="preserve"> но нет конечного</w:t>
-      </w:r>
-      <w:r>
-        <w:t>, значит она началась</w:t>
-      </w:r>
-      <w:r>
-        <w:t xml:space="preserve"> и является текущей</w:t>
-      </w:r>
-      <w:r>
-        <w:t>, если у нее есть время завершения, то она значит завершённая.</w:t>
-      </w:r>
-      <w:r>
-        <w:t xml:space="preserve"> </w:t>
-      </w:r>
-    </w:p>
-    <w:p>
-      <w:r>
-        <w:lastRenderedPageBreak/>
-        <w:t xml:space="preserve">По сообщению </w:t>
-      </w:r>
-      <w:proofErr w:type="spellStart"/>
-      <w:r>
         <w:t>TransactionEvent</w:t>
       </w:r>
-      <w:proofErr w:type="spellEnd"/>
-      <w:r>
-        <w:t xml:space="preserve"> с типом </w:t>
-      </w:r>
-      <w:proofErr w:type="spellStart"/>
-      <w:r>
-        <w:t>Started</w:t>
-      </w:r>
-      <w:proofErr w:type="spellEnd"/>
-      <w:r>
-        <w:t xml:space="preserve"> в уже созданную сессию записываются время старта и начальное значение счётчика энергии</w:t>
-      </w:r>
-      <w:r>
-        <w:t xml:space="preserve">. </w:t>
-      </w:r>
-      <w:r>
-        <w:t xml:space="preserve">Сообщение </w:t>
-      </w:r>
-      <w:proofErr w:type="spellStart"/>
-      <w:r>
-        <w:rPr>
-          <w:lang w:val="en-US"/>
-        </w:rPr>
-        <w:t>TransactionEvent</w:t>
-      </w:r>
-      <w:proofErr w:type="spellEnd"/>
       <w:r>
         <w:t xml:space="preserve"> с типом </w:t>
       </w:r>
@@ -9114,27 +8738,11 @@
     </w:p>
     <w:p>
       <w:r>
-        <w:t xml:space="preserve">Для привязки станции пользователь получает в приложении адрес сервера с признаком своей учётной записи и вводит его на станции. Станция открывает соединение и отправляет </w:t>
-      </w:r>
-      <w:proofErr w:type="spellStart"/>
-      <w:r>
-        <w:t>BootNotification</w:t>
-      </w:r>
-      <w:proofErr w:type="spellEnd"/>
-      <w:r>
-        <w:t xml:space="preserve">. После получения данного сообщения сервер связывает станцию с учётной записью, которой принадлежал этот адрес и сохраняет идентификатор станции. Затем станция </w:t>
+        <w:t xml:space="preserve">Для привязки станции пользователь получает в приложении адрес сервера с признаком своей учётной записи и вводит его на станции. Станция открывает соединение и отправляет BootNotification. После получения данного сообщения сервер связывает станцию с учётной записью, которой принадлежал этот адрес и сохраняет идентификатор станции. Затем станция </w:t>
       </w:r>
       <w:r>
         <w:lastRenderedPageBreak/>
-        <w:t xml:space="preserve">отправляет </w:t>
-      </w:r>
-      <w:proofErr w:type="spellStart"/>
-      <w:r>
-        <w:t>StatusNotification</w:t>
-      </w:r>
-      <w:proofErr w:type="spellEnd"/>
-      <w:r>
-        <w:t xml:space="preserve"> по каждому коннектору, сервер сохраняет номер коннектора и его статус. После получения станции и всех ее коннекторов станция считается привязанной к пользователю.</w:t>
+        <w:t>отправляет StatusNotification по каждому коннектору, сервер сохраняет номер коннектора и его статус. После получения станции и всех ее коннекторов станция считается привязанной к пользователю.</w:t>
       </w:r>
     </w:p>
     <w:p>
@@ -9151,29 +8759,19 @@
         <w:t xml:space="preserve"> текущего</w:t>
       </w:r>
       <w:r>
-        <w:t xml:space="preserve"> пользователя. Если у пользователя уже есть текущая сессия, новая не создаётся и приложение получает сообщение об ошибке. Если станция недоступна, результат тот же. </w:t>
+        <w:t xml:space="preserve"> пользователя. Если у </w:t>
+      </w:r>
+      <w:r>
+        <w:t>станции</w:t>
+      </w:r>
+      <w:r>
+        <w:t xml:space="preserve"> уже есть текущая сессия, новая не создаётся и приложение получает сообщение об ошибке. Если станция недоступна, результат тот же. </w:t>
       </w:r>
       <w:r>
         <w:t>Если предыдущие условия выполнены, то</w:t>
       </w:r>
       <w:r>
-        <w:t xml:space="preserve"> сервер отправляет </w:t>
-      </w:r>
-      <w:proofErr w:type="spellStart"/>
-      <w:r>
-        <w:t>RequestStartTransaction</w:t>
-      </w:r>
-      <w:proofErr w:type="spellEnd"/>
-      <w:r>
-        <w:t xml:space="preserve">. При ответе </w:t>
-      </w:r>
-      <w:proofErr w:type="spellStart"/>
-      <w:r>
-        <w:t>Rejected</w:t>
-      </w:r>
-      <w:proofErr w:type="spellEnd"/>
-      <w:r>
-        <w:t xml:space="preserve"> или при отсутствии ответа сессия не создаётся, пользователь видит ошибку. При</w:t>
+        <w:t xml:space="preserve"> сервер отправляет RequestStartTransaction. При ответе Rejected или при отсутствии ответа сессия не создаётся, пользователь видит ошибку. При</w:t>
       </w:r>
       <w:r>
         <w:t xml:space="preserve"> </w:t>
@@ -9208,14 +8806,12 @@
       <w:r>
         <w:t xml:space="preserve"> </w:t>
       </w:r>
-      <w:proofErr w:type="spellStart"/>
       <w:r>
         <w:rPr>
           <w:lang w:val="en-US"/>
         </w:rPr>
         <w:t>TransactionEvent</w:t>
       </w:r>
-      <w:proofErr w:type="spellEnd"/>
       <w:r>
         <w:t xml:space="preserve"> </w:t>
       </w:r>
@@ -9256,10 +8852,10 @@
         </w:rPr>
         <w:lastRenderedPageBreak/>
         <w:drawing>
-          <wp:inline distT="0" distB="0" distL="0" distR="0" wp14:anchorId="235E74D6" wp14:editId="672E03C1">
-            <wp:extent cx="5031645" cy="8842724"/>
-            <wp:effectExtent l="0" t="0" r="0" b="0"/>
-            <wp:docPr id="8" name="Рисунок 8"/>
+          <wp:inline distT="0" distB="0" distL="0" distR="0" wp14:anchorId="04CC7FF9" wp14:editId="5B7AD373">
+            <wp:extent cx="4137711" cy="7274460"/>
+            <wp:effectExtent l="0" t="0" r="0" b="3175"/>
+            <wp:docPr id="10" name="Рисунок 10"/>
             <wp:cNvGraphicFramePr>
               <a:graphicFrameLocks xmlns:a="http://schemas.openxmlformats.org/drawingml/2006/main" noChangeAspect="1"/>
             </wp:cNvGraphicFramePr>
@@ -9267,7 +8863,7 @@
               <a:graphicData uri="http://schemas.openxmlformats.org/drawingml/2006/picture">
                 <pic:pic xmlns:pic="http://schemas.openxmlformats.org/drawingml/2006/picture">
                   <pic:nvPicPr>
-                    <pic:cNvPr id="0" name="Picture 3"/>
+                    <pic:cNvPr id="0" name="Picture 1"/>
                     <pic:cNvPicPr>
                       <a:picLocks noChangeAspect="1" noChangeArrowheads="1"/>
                     </pic:cNvPicPr>
@@ -9288,7 +8884,7 @@
                   <pic:spPr bwMode="auto">
                     <a:xfrm>
                       <a:off x="0" y="0"/>
-                      <a:ext cx="5043177" cy="8862991"/>
+                      <a:ext cx="4140432" cy="7279244"/>
                     </a:xfrm>
                     <a:prstGeom prst="rect">
                       <a:avLst/>
@@ -9325,21 +8921,8 @@
         <w:t>С</w:t>
       </w:r>
       <w:r>
-        <w:t xml:space="preserve">ервер принимает </w:t>
-      </w:r>
-      <w:proofErr w:type="spellStart"/>
-      <w:r>
-        <w:t>TransactionEvent</w:t>
-      </w:r>
-      <w:proofErr w:type="spellEnd"/>
-      <w:r>
-        <w:t xml:space="preserve"> с типом </w:t>
-      </w:r>
-      <w:proofErr w:type="spellStart"/>
-      <w:r>
-        <w:t>Updated</w:t>
-      </w:r>
-      <w:proofErr w:type="spellEnd"/>
+        <w:t>ервер принимает TransactionEvent с типом Updated</w:t>
+      </w:r>
       <w:r>
         <w:t>, при помощи которого обновляется</w:t>
       </w:r>
@@ -9355,11 +8938,8 @@
     </w:p>
     <w:p>
       <w:r>
-        <w:t xml:space="preserve">По </w:t>
-      </w:r>
-      <w:proofErr w:type="spellStart"/>
-      <w:r>
-        <w:t>к</w:t>
+        <w:lastRenderedPageBreak/>
+        <w:t>По к</w:t>
       </w:r>
       <w:r>
         <w:t>оманд</w:t>
@@ -9367,50 +8947,20 @@
       <w:r>
         <w:t>не</w:t>
       </w:r>
-      <w:proofErr w:type="spellEnd"/>
       <w:r>
         <w:t xml:space="preserve"> «Стоп» из приложения</w:t>
       </w:r>
       <w:r>
         <w:t xml:space="preserve">, сервер отправляет сообщение </w:t>
       </w:r>
-      <w:proofErr w:type="spellStart"/>
-      <w:r>
-        <w:t>RequestStopTransaction</w:t>
-      </w:r>
-      <w:proofErr w:type="spellEnd"/>
-      <w:r>
-        <w:t xml:space="preserve">. Сессия остаётся текущей, пока станция не пришлёт </w:t>
-      </w:r>
-      <w:proofErr w:type="spellStart"/>
-      <w:r>
-        <w:t>TransactionEvent</w:t>
-      </w:r>
-      <w:proofErr w:type="spellEnd"/>
-      <w:r>
-        <w:t xml:space="preserve"> с типом </w:t>
-      </w:r>
-      <w:proofErr w:type="spellStart"/>
-      <w:r>
-        <w:t>Ended</w:t>
-      </w:r>
-      <w:proofErr w:type="spellEnd"/>
-      <w:r>
-        <w:t xml:space="preserve">. Таким же сообщением станция может завершить сессию </w:t>
+      <w:r>
+        <w:t xml:space="preserve">RequestStopTransaction. Сессия остаётся текущей, пока станция не пришлёт TransactionEvent с типом Ended. Таким же сообщением станция может завершить сессию </w:t>
       </w:r>
       <w:r>
         <w:t>самостоятельно</w:t>
       </w:r>
       <w:r>
-        <w:t xml:space="preserve">. По </w:t>
-      </w:r>
-      <w:proofErr w:type="spellStart"/>
-      <w:r>
-        <w:t>Ended</w:t>
-      </w:r>
-      <w:proofErr w:type="spellEnd"/>
-      <w:r>
-        <w:t xml:space="preserve"> сервер записывает время окончания </w:t>
+        <w:t xml:space="preserve">. По Ended сервер записывает время окончания </w:t>
       </w:r>
       <w:r>
         <w:t>и,</w:t>
@@ -9798,25 +9348,21 @@
       <w:r>
         <w:t xml:space="preserve">отсылая сообщение </w:t>
       </w:r>
-      <w:proofErr w:type="spellStart"/>
       <w:r>
         <w:rPr>
           <w:lang w:val="en-US"/>
         </w:rPr>
         <w:t>BootNotification</w:t>
       </w:r>
-      <w:proofErr w:type="spellEnd"/>
       <w:r>
         <w:t xml:space="preserve">, так же ей в автоматическом режиме подключаются все коннектора из сообщений </w:t>
       </w:r>
-      <w:proofErr w:type="spellStart"/>
       <w:r>
         <w:rPr>
           <w:lang w:val="en-US"/>
         </w:rPr>
         <w:t>StatusNotification</w:t>
       </w:r>
-      <w:proofErr w:type="spellEnd"/>
       <w:r>
         <w:t>.</w:t>
       </w:r>
@@ -9996,23 +9542,7 @@
         <w:t xml:space="preserve">На момент пока сессия не запустилась отображается индикатор выполнения запроса. </w:t>
       </w:r>
       <w:r>
-        <w:t xml:space="preserve">После </w:t>
-      </w:r>
-      <w:proofErr w:type="spellStart"/>
-      <w:r>
-        <w:t>TransactionEvent</w:t>
-      </w:r>
-      <w:proofErr w:type="spellEnd"/>
-      <w:r>
-        <w:t xml:space="preserve"> с типом </w:t>
-      </w:r>
-      <w:proofErr w:type="spellStart"/>
-      <w:r>
-        <w:t>Started</w:t>
-      </w:r>
-      <w:proofErr w:type="spellEnd"/>
-      <w:r>
-        <w:t xml:space="preserve"> экран показывает, что сессия </w:t>
+        <w:t xml:space="preserve">После TransactionEvent с типом Started экран показывает, что сессия </w:t>
       </w:r>
       <w:r>
         <w:t>началась и отображается</w:t>
@@ -10739,27 +10269,87 @@
         <w:t xml:space="preserve"> данными</w:t>
       </w:r>
       <w:r>
-        <w:t xml:space="preserve"> со станцией по протоколу OCPP 2.0.1 поверх </w:t>
-      </w:r>
-      <w:proofErr w:type="spellStart"/>
-      <w:r>
+        <w:t xml:space="preserve"> со станцией по протоколу OCPP 2.0.1 поверх WebSocket, мобильное приложение</w:t>
+      </w:r>
+      <w:r>
+        <w:t xml:space="preserve"> </w:t>
+      </w:r>
+      <w:r>
+        <w:t>и</w:t>
+      </w:r>
+      <w:r>
+        <w:t xml:space="preserve"> веб-портал администратора</w:t>
+      </w:r>
+      <w:r>
+        <w:t xml:space="preserve"> общаются с сервером по протоколу </w:t>
+      </w:r>
+      <w:r>
+        <w:rPr>
+          <w:lang w:val="en-US"/>
+        </w:rPr>
+        <w:t>HTTP</w:t>
+      </w:r>
+      <w:r>
+        <w:t>,</w:t>
+      </w:r>
+      <w:r>
+        <w:t xml:space="preserve"> </w:t>
+      </w:r>
+      <w:r>
+        <w:t>хранение данных производиться в реляционную базу данных</w:t>
+      </w:r>
+      <w:r>
+        <w:t>.</w:t>
+      </w:r>
+      <w:r>
+        <w:t xml:space="preserve"> Для поддержки передачи в реальном времени данных от сервера к мобильному приложению, мобильное приложение использует протокол </w:t>
+      </w:r>
+      <w:r>
+        <w:rPr>
+          <w:lang w:val="en-US"/>
+        </w:rPr>
         <w:t>WebSocket</w:t>
       </w:r>
-      <w:proofErr w:type="spellEnd"/>
-      <w:r>
-        <w:t>, мобильное приложение</w:t>
+      <w:r>
+        <w:t>.</w:t>
+      </w:r>
+    </w:p>
+    <w:p>
+      <w:r>
+        <w:t>Для</w:t>
+      </w:r>
+      <w:r>
+        <w:t xml:space="preserve"> выбора</w:t>
+      </w:r>
+      <w:r>
+        <w:t xml:space="preserve"> сервера </w:t>
+      </w:r>
+      <w:r>
+        <w:t>сравним два типа технологий,</w:t>
+      </w:r>
+      <w:r>
+        <w:t xml:space="preserve"> ASP.NET Core и Laravel</w:t>
+      </w:r>
+      <w:r>
+        <w:t>(</w:t>
+      </w:r>
+      <w:r>
+        <w:rPr>
+          <w:lang w:val="en-US"/>
+        </w:rPr>
+        <w:t>PHP</w:t>
+      </w:r>
+      <w:r>
+        <w:t>)</w:t>
+      </w:r>
+      <w:r>
+        <w:t>. Оба могут отдать данные мобильному приложению и порталу администратора</w:t>
       </w:r>
       <w:r>
         <w:t xml:space="preserve"> </w:t>
       </w:r>
       <w:r>
-        <w:t>и</w:t>
-      </w:r>
-      <w:r>
-        <w:t xml:space="preserve"> веб-портал администратора</w:t>
-      </w:r>
-      <w:r>
-        <w:t xml:space="preserve"> общаются с сервером по протоколу </w:t>
+        <w:t xml:space="preserve">по протоколу </w:t>
       </w:r>
       <w:r>
         <w:rPr>
@@ -10768,177 +10358,68 @@
         <w:t>HTTP</w:t>
       </w:r>
       <w:r>
+        <w:t>.</w:t>
+      </w:r>
+      <w:r>
+        <w:t xml:space="preserve"> </w:t>
+      </w:r>
+      <w:r>
+        <w:t>Однако,</w:t>
+      </w:r>
+      <w:r>
+        <w:t xml:space="preserve"> </w:t>
+      </w:r>
+      <w:r>
+        <w:t>о</w:t>
+      </w:r>
+      <w:r>
+        <w:t>бмен по OCPP 2.0.1 требует, чтобы соединение со станцией оставалось открытым. В Laravel для этого поднимают отдельный процесс. ASP.NET Core принимает соединения станций и запросы клиентов в одном экземпляре. Поэтому выбран ASP.NET Core</w:t>
+      </w:r>
+      <w:r>
+        <w:t>.</w:t>
+      </w:r>
+    </w:p>
+    <w:p>
+      <w:r>
+        <w:t xml:space="preserve">Для портала администратора сравнивались Vue.js и Angular. </w:t>
+      </w:r>
+      <w:r>
+        <w:t>Оба позволяют реализовать необходимый функционал, но</w:t>
+      </w:r>
+      <w:r>
+        <w:t xml:space="preserve"> Angular </w:t>
+      </w:r>
+      <w:r>
+        <w:t>более сложный и избыточный, а</w:t>
+      </w:r>
+      <w:r>
+        <w:t xml:space="preserve"> Vue.</w:t>
+      </w:r>
+      <w:r>
+        <w:rPr>
+          <w:lang w:val="en-US"/>
+        </w:rPr>
+        <w:t>js</w:t>
+      </w:r>
+      <w:r>
+        <w:t xml:space="preserve"> </w:t>
+      </w:r>
+      <w:r>
+        <w:t>является более легким</w:t>
+      </w:r>
+      <w:r>
+        <w:t>.</w:t>
+      </w:r>
+      <w:r>
+        <w:t xml:space="preserve"> </w:t>
+      </w:r>
+      <w:r>
+        <w:t>Поскольку портал состоит из нескольких страниц</w:t>
+      </w:r>
+      <w:r>
         <w:t>,</w:t>
       </w:r>
       <w:r>
-        <w:t xml:space="preserve"> </w:t>
-      </w:r>
-      <w:r>
-        <w:t>хранение данных производиться в реляционную базу данных</w:t>
-      </w:r>
-      <w:r>
-        <w:t>.</w:t>
-      </w:r>
-      <w:r>
-        <w:t xml:space="preserve"> Для поддержки передачи в реальном времени данных от сервера к мобильному приложению, мобильное приложение использует протокол </w:t>
-      </w:r>
-      <w:r>
-        <w:rPr>
-          <w:lang w:val="en-US"/>
-        </w:rPr>
-        <w:t>WebSocket</w:t>
-      </w:r>
-      <w:r>
-        <w:t>.</w:t>
-      </w:r>
-    </w:p>
-    <w:p>
-      <w:r>
-        <w:t>Для</w:t>
-      </w:r>
-      <w:r>
-        <w:t xml:space="preserve"> выбора</w:t>
-      </w:r>
-      <w:r>
-        <w:t xml:space="preserve"> сервера </w:t>
-      </w:r>
-      <w:r>
-        <w:t>сравним два типа технологий,</w:t>
-      </w:r>
-      <w:r>
-        <w:t xml:space="preserve"> ASP.NET Core и </w:t>
-      </w:r>
-      <w:proofErr w:type="spellStart"/>
-      <w:proofErr w:type="gramStart"/>
-      <w:r>
-        <w:t>Laravel</w:t>
-      </w:r>
-      <w:proofErr w:type="spellEnd"/>
-      <w:r>
-        <w:t>(</w:t>
-      </w:r>
-      <w:proofErr w:type="gramEnd"/>
-      <w:r>
-        <w:rPr>
-          <w:lang w:val="en-US"/>
-        </w:rPr>
-        <w:t>PHP</w:t>
-      </w:r>
-      <w:r>
-        <w:t>)</w:t>
-      </w:r>
-      <w:r>
-        <w:t>. Оба могут отдать данные мобильному приложению и порталу администратора</w:t>
-      </w:r>
-      <w:r>
-        <w:t xml:space="preserve"> </w:t>
-      </w:r>
-      <w:r>
-        <w:t xml:space="preserve">по протоколу </w:t>
-      </w:r>
-      <w:r>
-        <w:rPr>
-          <w:lang w:val="en-US"/>
-        </w:rPr>
-        <w:t>HTTP</w:t>
-      </w:r>
-      <w:r>
-        <w:t>.</w:t>
-      </w:r>
-      <w:r>
-        <w:t xml:space="preserve"> </w:t>
-      </w:r>
-      <w:r>
-        <w:t>Однако,</w:t>
-      </w:r>
-      <w:r>
-        <w:t xml:space="preserve"> </w:t>
-      </w:r>
-      <w:r>
-        <w:t>о</w:t>
-      </w:r>
-      <w:r>
-        <w:t xml:space="preserve">бмен по OCPP 2.0.1 требует, чтобы соединение со станцией оставалось открытым. В </w:t>
-      </w:r>
-      <w:proofErr w:type="spellStart"/>
-      <w:r>
-        <w:t>Laravel</w:t>
-      </w:r>
-      <w:proofErr w:type="spellEnd"/>
-      <w:r>
-        <w:t xml:space="preserve"> для этого поднимают отдельный процесс. ASP.NET Core принимает соединения станций и запросы клиентов в одном экземпляре. Поэтому выбран ASP.NET Core</w:t>
-      </w:r>
-      <w:r>
-        <w:t>.</w:t>
-      </w:r>
-    </w:p>
-    <w:p>
-      <w:r>
-        <w:t xml:space="preserve">Для портала администратора сравнивались Vue.js и </w:t>
-      </w:r>
-      <w:proofErr w:type="spellStart"/>
-      <w:r>
-        <w:t>Angular</w:t>
-      </w:r>
-      <w:proofErr w:type="spellEnd"/>
-      <w:r>
-        <w:t xml:space="preserve">. </w:t>
-      </w:r>
-      <w:r>
-        <w:t>Оба позволяют реализовать необходимый функционал, но</w:t>
-      </w:r>
-      <w:r>
-        <w:t xml:space="preserve"> </w:t>
-      </w:r>
-      <w:proofErr w:type="spellStart"/>
-      <w:r>
-        <w:t>Angular</w:t>
-      </w:r>
-      <w:proofErr w:type="spellEnd"/>
-      <w:r>
-        <w:t xml:space="preserve"> </w:t>
-      </w:r>
-      <w:r>
-        <w:t>более сложный и избыточный, а</w:t>
-      </w:r>
-      <w:r>
-        <w:t xml:space="preserve"> </w:t>
-      </w:r>
-      <w:proofErr w:type="spellStart"/>
-      <w:r>
-        <w:t>Vue</w:t>
-      </w:r>
-      <w:proofErr w:type="spellEnd"/>
-      <w:r>
-        <w:t>.</w:t>
-      </w:r>
-      <w:proofErr w:type="spellStart"/>
-      <w:r>
-        <w:rPr>
-          <w:lang w:val="en-US"/>
-        </w:rPr>
-        <w:t>js</w:t>
-      </w:r>
-      <w:proofErr w:type="spellEnd"/>
-      <w:r>
-        <w:t xml:space="preserve"> </w:t>
-      </w:r>
-      <w:r>
-        <w:t>является более легким</w:t>
-      </w:r>
-      <w:r>
-        <w:t>.</w:t>
-      </w:r>
-      <w:r>
-        <w:t xml:space="preserve"> </w:t>
-      </w:r>
-      <w:r>
-        <w:t>Поскольку портал состоит из нескольких страниц</w:t>
-      </w:r>
-      <w:r>
-        <w:t>,</w:t>
-      </w:r>
-      <w:r>
         <w:t xml:space="preserve"> был </w:t>
       </w:r>
       <w:r>
@@ -10953,52 +10434,26 @@
         <w:t xml:space="preserve"> данных</w:t>
       </w:r>
       <w:r>
-        <w:t xml:space="preserve"> сравнивались </w:t>
-      </w:r>
-      <w:proofErr w:type="spellStart"/>
+        <w:t xml:space="preserve"> сравнивались PostgreSQL и SQLite. </w:t>
+      </w:r>
+      <w:r>
+        <w:t>Обе СУБД хранят данные в реляционном виде</w:t>
+      </w:r>
+      <w:r>
+        <w:t xml:space="preserve">. SQLite </w:t>
+      </w:r>
+      <w:r>
+        <w:t>не имеет возможности выполнять параллельные записи в базу, поскольку станций может быть</w:t>
+      </w:r>
+      <w:r>
+        <w:t xml:space="preserve"> несколько и сообщения от них приходят одновременно</w:t>
+      </w:r>
+      <w:r>
+        <w:t xml:space="preserve">, а </w:t>
+      </w:r>
       <w:r>
         <w:t>PostgreSQL</w:t>
       </w:r>
-      <w:proofErr w:type="spellEnd"/>
-      <w:r>
-        <w:t xml:space="preserve"> и </w:t>
-      </w:r>
-      <w:proofErr w:type="spellStart"/>
-      <w:r>
-        <w:t>SQLite</w:t>
-      </w:r>
-      <w:proofErr w:type="spellEnd"/>
-      <w:r>
-        <w:t xml:space="preserve">. </w:t>
-      </w:r>
-      <w:r>
-        <w:t>Обе СУБД хранят данные в реляционном виде</w:t>
-      </w:r>
-      <w:r>
-        <w:t xml:space="preserve">. </w:t>
-      </w:r>
-      <w:proofErr w:type="spellStart"/>
-      <w:r>
-        <w:t>SQLite</w:t>
-      </w:r>
-      <w:proofErr w:type="spellEnd"/>
-      <w:r>
-        <w:t xml:space="preserve"> </w:t>
-      </w:r>
-      <w:r>
-        <w:t>не имеет возможности выполнять параллельные записи в базу, поскольку станций может быть</w:t>
-      </w:r>
-      <w:r>
-        <w:t xml:space="preserve"> несколько и сообщения от них приходят одновременно</w:t>
-      </w:r>
-      <w:r>
-        <w:t xml:space="preserve">, а </w:t>
-      </w:r>
-      <w:proofErr w:type="spellStart"/>
-      <w:r>
-        <w:t>PostgreSQL</w:t>
-      </w:r>
-      <w:proofErr w:type="spellEnd"/>
       <w:r>
         <w:t xml:space="preserve"> может выполнять запись данных в параллельном режиме, п</w:t>
       </w:r>
@@ -11009,100 +10464,12 @@
         <w:t xml:space="preserve"> был</w:t>
       </w:r>
       <w:r>
-        <w:t xml:space="preserve"> выбрана </w:t>
-      </w:r>
-      <w:proofErr w:type="spellStart"/>
-      <w:r>
-        <w:t>PostgreSQL</w:t>
-      </w:r>
-      <w:proofErr w:type="spellEnd"/>
-      <w:r>
-        <w:t xml:space="preserve">. </w:t>
-      </w:r>
-    </w:p>
-    <w:p>
-      <w:r>
-        <w:t xml:space="preserve">Для мобильного приложения сравнивались </w:t>
-      </w:r>
-      <w:proofErr w:type="spellStart"/>
-      <w:r>
-        <w:t>Flutter</w:t>
-      </w:r>
-      <w:proofErr w:type="spellEnd"/>
-      <w:r>
-        <w:t xml:space="preserve"> и </w:t>
-      </w:r>
-      <w:proofErr w:type="spellStart"/>
-      <w:r>
-        <w:t>React</w:t>
-      </w:r>
-      <w:proofErr w:type="spellEnd"/>
-      <w:r>
-        <w:t xml:space="preserve"> </w:t>
-      </w:r>
-      <w:proofErr w:type="spellStart"/>
-      <w:r>
-        <w:t>Native</w:t>
-      </w:r>
-      <w:proofErr w:type="spellEnd"/>
-      <w:r>
-        <w:t xml:space="preserve">. Оба собирают одну программу для </w:t>
-      </w:r>
-      <w:proofErr w:type="spellStart"/>
-      <w:r>
-        <w:t>Android</w:t>
-      </w:r>
-      <w:proofErr w:type="spellEnd"/>
-      <w:r>
-        <w:t xml:space="preserve"> и </w:t>
-      </w:r>
-      <w:proofErr w:type="spellStart"/>
-      <w:r>
-        <w:t>iOS</w:t>
-      </w:r>
-      <w:proofErr w:type="spellEnd"/>
-      <w:r>
-        <w:t xml:space="preserve"> и закрывают экраны пункта 2.9.1. </w:t>
-      </w:r>
-      <w:proofErr w:type="spellStart"/>
-      <w:r>
-        <w:t>React</w:t>
-      </w:r>
-      <w:proofErr w:type="spellEnd"/>
-      <w:r>
-        <w:t xml:space="preserve"> </w:t>
-      </w:r>
-      <w:proofErr w:type="spellStart"/>
-      <w:r>
-        <w:t>Native</w:t>
-      </w:r>
-      <w:proofErr w:type="spellEnd"/>
-      <w:r>
-        <w:t xml:space="preserve"> рисует их системными элементами, поэтому один и тот же макет на </w:t>
-      </w:r>
-      <w:proofErr w:type="spellStart"/>
-      <w:r>
-        <w:t>Android</w:t>
-      </w:r>
-      <w:proofErr w:type="spellEnd"/>
-      <w:r>
-        <w:t xml:space="preserve"> и </w:t>
-      </w:r>
-      <w:proofErr w:type="spellStart"/>
-      <w:r>
-        <w:t>iOS</w:t>
-      </w:r>
-      <w:proofErr w:type="spellEnd"/>
-      <w:r>
-        <w:t xml:space="preserve"> может отличаться. </w:t>
-      </w:r>
-      <w:proofErr w:type="spellStart"/>
-      <w:r>
-        <w:t>Flutter</w:t>
-      </w:r>
-      <w:proofErr w:type="spellEnd"/>
-      <w:r>
-        <w:t xml:space="preserve"> рисует интерфейс сам</w:t>
+        <w:t xml:space="preserve"> выбрана PostgreSQL. </w:t>
+      </w:r>
+    </w:p>
+    <w:p>
+      <w:r>
+        <w:t>Для мобильного приложения сравнивались Flutter и React Native. Оба собирают одну программу для Android и iOS и закрывают экраны пункта 2.9.1. React Native рисует их системными элементами, поэтому один и тот же макет на Android и iOS может отличаться. Flutter рисует интерфейс сам</w:t>
       </w:r>
       <w:r>
         <w:t xml:space="preserve"> поэтому все элементы управления будут выглядеть одинаково на всех платформах. Выбор был сделан в пользу </w:t>
@@ -11333,13 +10700,8 @@
               <w:t xml:space="preserve"> и</w:t>
             </w:r>
             <w:r>
-              <w:t xml:space="preserve"> </w:t>
-            </w:r>
-            <w:proofErr w:type="spellStart"/>
-            <w:r>
-              <w:t>Angular</w:t>
-            </w:r>
-            <w:proofErr w:type="spellEnd"/>
+              <w:t xml:space="preserve"> Angular</w:t>
+            </w:r>
           </w:p>
         </w:tc>
         <w:tc>
@@ -11410,19 +10772,15 @@
               <w:spacing w:line="240" w:lineRule="auto"/>
               <w:ind w:firstLine="0"/>
             </w:pPr>
-            <w:proofErr w:type="spellStart"/>
             <w:r>
               <w:t>PostgreSQL</w:t>
             </w:r>
-            <w:proofErr w:type="spellEnd"/>
             <w:r>
               <w:t xml:space="preserve"> и </w:t>
             </w:r>
-            <w:proofErr w:type="spellStart"/>
             <w:r>
               <w:t>SQLite</w:t>
             </w:r>
-            <w:proofErr w:type="spellEnd"/>
           </w:p>
         </w:tc>
         <w:tc>
@@ -11434,11 +10792,9 @@
               <w:spacing w:line="240" w:lineRule="auto"/>
               <w:ind w:firstLine="0"/>
             </w:pPr>
-            <w:proofErr w:type="spellStart"/>
             <w:r>
               <w:t>PostgreSQL</w:t>
             </w:r>
-            <w:proofErr w:type="spellEnd"/>
           </w:p>
         </w:tc>
         <w:tc>
@@ -11486,30 +10842,15 @@
               <w:spacing w:line="240" w:lineRule="auto"/>
               <w:ind w:firstLine="0"/>
             </w:pPr>
-            <w:proofErr w:type="spellStart"/>
             <w:r>
               <w:t>Flutter</w:t>
             </w:r>
-            <w:proofErr w:type="spellEnd"/>
             <w:r>
               <w:t xml:space="preserve"> и</w:t>
             </w:r>
             <w:r>
-              <w:t xml:space="preserve"> </w:t>
-            </w:r>
-            <w:proofErr w:type="spellStart"/>
-            <w:r>
-              <w:t>React</w:t>
-            </w:r>
-            <w:proofErr w:type="spellEnd"/>
-            <w:r>
-              <w:t xml:space="preserve"> </w:t>
-            </w:r>
-            <w:proofErr w:type="spellStart"/>
-            <w:r>
-              <w:t>Native</w:t>
-            </w:r>
-            <w:proofErr w:type="spellEnd"/>
+              <w:t xml:space="preserve"> React Native</w:t>
+            </w:r>
           </w:p>
         </w:tc>
         <w:tc>
@@ -11521,11 +10862,9 @@
               <w:spacing w:line="240" w:lineRule="auto"/>
               <w:ind w:firstLine="0"/>
             </w:pPr>
-            <w:proofErr w:type="spellStart"/>
             <w:r>
               <w:t>Flutter</w:t>
             </w:r>
-            <w:proofErr w:type="spellEnd"/>
           </w:p>
         </w:tc>
         <w:tc>
@@ -11538,21 +10877,8 @@
               <w:ind w:firstLine="0"/>
             </w:pPr>
             <w:r>
-              <w:t xml:space="preserve">Одинаковый вид экранов на </w:t>
-            </w:r>
-            <w:proofErr w:type="spellStart"/>
-            <w:r>
-              <w:t>Android</w:t>
-            </w:r>
-            <w:proofErr w:type="spellEnd"/>
-            <w:r>
-              <w:t xml:space="preserve"> и </w:t>
-            </w:r>
-            <w:proofErr w:type="spellStart"/>
-            <w:r>
-              <w:t>iOS</w:t>
-            </w:r>
-            <w:proofErr w:type="spellEnd"/>
+              <w:t>Одинаковый вид экранов на Android и iOS</w:t>
+            </w:r>
           </w:p>
           <w:p>
             <w:pPr>
@@ -11602,77 +10928,22 @@
     </w:p>
     <w:p>
       <w:r>
-        <w:t xml:space="preserve">Сервер на ASP.NET Core принимает соединение станции по </w:t>
-      </w:r>
-      <w:proofErr w:type="spellStart"/>
-      <w:r>
-        <w:t>WebSocket</w:t>
-      </w:r>
-      <w:proofErr w:type="spellEnd"/>
-      <w:r>
-        <w:t xml:space="preserve"> и сообщения </w:t>
-      </w:r>
-      <w:proofErr w:type="spellStart"/>
-      <w:r>
-        <w:t>BootNotification</w:t>
-      </w:r>
-      <w:proofErr w:type="spellEnd"/>
-      <w:r>
-        <w:t xml:space="preserve">, </w:t>
-      </w:r>
-      <w:proofErr w:type="spellStart"/>
-      <w:r>
-        <w:t>Heartbeat</w:t>
-      </w:r>
-      <w:proofErr w:type="spellEnd"/>
-      <w:r>
-        <w:t xml:space="preserve">, </w:t>
-      </w:r>
-      <w:proofErr w:type="spellStart"/>
-      <w:r>
-        <w:t>StatusNotification</w:t>
-      </w:r>
-      <w:proofErr w:type="spellEnd"/>
-      <w:r>
-        <w:t xml:space="preserve">, </w:t>
-      </w:r>
-      <w:proofErr w:type="spellStart"/>
+        <w:t xml:space="preserve">Сервер на ASP.NET Core принимает соединение станции по WebSocket и сообщения BootNotification, Heartbeat, StatusNotification, </w:t>
+      </w:r>
       <w:r>
         <w:lastRenderedPageBreak/>
-        <w:t>RequestStartTransaction</w:t>
-      </w:r>
-      <w:proofErr w:type="spellEnd"/>
-      <w:r>
-        <w:t xml:space="preserve">, </w:t>
-      </w:r>
-      <w:proofErr w:type="spellStart"/>
-      <w:r>
-        <w:t>RequestStopTransaction</w:t>
-      </w:r>
-      <w:proofErr w:type="spellEnd"/>
-      <w:r>
-        <w:t xml:space="preserve"> и </w:t>
-      </w:r>
-      <w:proofErr w:type="spellStart"/>
-      <w:r>
-        <w:t>TransactionEvent</w:t>
-      </w:r>
-      <w:proofErr w:type="spellEnd"/>
-      <w:r>
-        <w:t>. Он же отдаёт данные мобильному приложению и порталу администратора.</w:t>
-      </w:r>
-    </w:p>
-    <w:p>
-      <w:r>
-        <w:t xml:space="preserve">В </w:t>
-      </w:r>
-      <w:proofErr w:type="spellStart"/>
-      <w:r>
-        <w:t>PostgreSQL</w:t>
-      </w:r>
-      <w:proofErr w:type="spellEnd"/>
-      <w:r>
-        <w:t xml:space="preserve"> сохраняются учётные записи, станции, коннекторы и сессии. Журнал сообщений OCPP 2.0.1 хранится отдельно от истории сессий. У пользователя не больше одной текущей сессии</w:t>
+        <w:t>RequestStartTransaction, RequestStopTransaction и TransactionEvent. Он же отдаёт данные мобильному приложению и порталу администратора.</w:t>
+      </w:r>
+    </w:p>
+    <w:p>
+      <w:r>
+        <w:t xml:space="preserve">В PostgreSQL сохраняются учётные записи, станции, коннекторы и сессии. Журнал сообщений OCPP 2.0.1 хранится отдельно от истории сессий. У </w:t>
+      </w:r>
+      <w:r>
+        <w:t>станции</w:t>
+      </w:r>
+      <w:r>
+        <w:t xml:space="preserve"> не больше одной текущей сессии</w:t>
       </w:r>
       <w:r>
         <w:t>.</w:t>
@@ -11680,15 +10951,7 @@
     </w:p>
     <w:p>
       <w:r>
-        <w:t xml:space="preserve">Мобильное приложение на </w:t>
-      </w:r>
-      <w:proofErr w:type="spellStart"/>
-      <w:r>
-        <w:t>Flutter</w:t>
-      </w:r>
-      <w:proofErr w:type="spellEnd"/>
-      <w:r>
-        <w:t xml:space="preserve"> реализует экраны пункта 2.9.1: вход, регистрация, список станций, добавление, старт и остановка сессии, история, профиль и смена своего пароля.</w:t>
+        <w:t>Мобильное приложение на Flutter реализует экраны пункта 2.9.1: вход, регистрация, список станций, добавление, старт и остановка сессии, история, профиль и смена своего пароля.</w:t>
       </w:r>
     </w:p>
     <w:p>
@@ -11717,23 +10980,7 @@
         <w:ind w:left="709"/>
       </w:pPr>
       <w:r>
-        <w:t xml:space="preserve">станция с адресом сервера после </w:t>
-      </w:r>
-      <w:proofErr w:type="spellStart"/>
-      <w:r>
-        <w:t>BootNotification</w:t>
-      </w:r>
-      <w:proofErr w:type="spellEnd"/>
-      <w:r>
-        <w:t xml:space="preserve"> и </w:t>
-      </w:r>
-      <w:proofErr w:type="spellStart"/>
-      <w:r>
-        <w:t>StatusNotification</w:t>
-      </w:r>
-      <w:proofErr w:type="spellEnd"/>
-      <w:r>
-        <w:t xml:space="preserve"> закрепляется за учётной записью вместе с коннекторами</w:t>
+        <w:t>станция с адресом сервера после BootNotification и StatusNotification закрепляется за учётной записью вместе с коннекторами</w:t>
       </w:r>
     </w:p>
     <w:p>
@@ -11772,15 +11019,7 @@
         <w:ind w:left="709"/>
       </w:pPr>
       <w:r>
-        <w:t xml:space="preserve">при недоступной станции, неготовности коннектора или ответе не </w:t>
-      </w:r>
-      <w:proofErr w:type="spellStart"/>
-      <w:r>
-        <w:t>Accepted</w:t>
-      </w:r>
-      <w:proofErr w:type="spellEnd"/>
-      <w:r>
-        <w:t xml:space="preserve"> сессия не </w:t>
+        <w:t xml:space="preserve">при недоступной станции, неготовности коннектора или ответе не Accepted сессия не </w:t>
       </w:r>
       <w:r>
         <w:t>создается</w:t>
@@ -11807,14 +11046,12 @@
       <w:r>
         <w:t xml:space="preserve">после успешного ответа </w:t>
       </w:r>
-      <w:proofErr w:type="spellStart"/>
       <w:r>
         <w:rPr>
           <w:lang w:val="en-US"/>
         </w:rPr>
         <w:t>RequestStartTransaction</w:t>
       </w:r>
-      <w:proofErr w:type="spellEnd"/>
     </w:p>
     <w:p>
       <w:pPr>
@@ -11826,15 +11063,7 @@
         <w:ind w:left="709"/>
       </w:pPr>
       <w:r>
-        <w:t xml:space="preserve">сообщения </w:t>
-      </w:r>
-      <w:proofErr w:type="spellStart"/>
-      <w:r>
-        <w:t>Updated</w:t>
-      </w:r>
-      <w:proofErr w:type="spellEnd"/>
-      <w:r>
-        <w:t xml:space="preserve"> обновляют конечное значение счётчика и передаются в приложение</w:t>
+        <w:t>сообщения Updated обновляют конечное значение счётчика и передаются в приложение</w:t>
       </w:r>
     </w:p>
     <w:p>
@@ -11847,15 +11076,7 @@
         <w:ind w:left="709"/>
       </w:pPr>
       <w:r>
-        <w:t xml:space="preserve">по </w:t>
-      </w:r>
-      <w:proofErr w:type="spellStart"/>
-      <w:r>
-        <w:t>Ended</w:t>
-      </w:r>
-      <w:proofErr w:type="spellEnd"/>
-      <w:r>
-        <w:t xml:space="preserve"> записываются время окончания и конечное значение счётчика, сессия переходит в историю</w:t>
+        <w:t>по Ended записываются время окончания и конечное значение счётчика, сессия переходит в историю</w:t>
       </w:r>
     </w:p>
     <w:p>
@@ -12021,13 +11242,8 @@
               <w:ind w:firstLine="0"/>
             </w:pPr>
             <w:r>
-              <w:t xml:space="preserve">База </w:t>
-            </w:r>
-            <w:proofErr w:type="spellStart"/>
-            <w:r>
-              <w:t>PostgreSQL</w:t>
-            </w:r>
-            <w:proofErr w:type="spellEnd"/>
+              <w:t>База PostgreSQL</w:t>
+            </w:r>
           </w:p>
         </w:tc>
         <w:tc>
@@ -12203,47 +11419,607 @@
     </w:p>
     <w:p>
       <w:r>
-        <w:t xml:space="preserve">Для реализации выбраны сервер на ASP.NET Core, портал администратора на Vue.js, база данных </w:t>
-      </w:r>
-      <w:proofErr w:type="spellStart"/>
-      <w:r>
-        <w:t>PostgreSQL</w:t>
-      </w:r>
-      <w:proofErr w:type="spellEnd"/>
-      <w:r>
-        <w:t xml:space="preserve"> и мобильное приложение на </w:t>
-      </w:r>
-      <w:proofErr w:type="spellStart"/>
-      <w:r>
+        <w:t>Для реализации выбраны сервер на ASP.NET Core, портал администратора на Vue.js, база данных PostgreSQL и мобильное приложение на Flutter. Экраны приложения и портала спроектированы</w:t>
+      </w:r>
+      <w:r>
+        <w:t xml:space="preserve"> и предоставлены в виде макетов</w:t>
+      </w:r>
+      <w:r>
+        <w:t>. Приёмка в главе 3 выполняется по контрольным примерам</w:t>
+      </w:r>
+      <w:r>
+        <w:t xml:space="preserve"> приведенным в данной главе</w:t>
+      </w:r>
+      <w:r>
+        <w:t>: привязка станции, запуск не более чем за три действия, отказ без создания сессии, история своих завершённых сессий, смена пароля пользователем и администратором.</w:t>
+      </w:r>
+    </w:p>
+    <w:p>
+      <w:r>
+        <w:br w:type="page"/>
+      </w:r>
+    </w:p>
+    <w:p>
+      <w:pPr>
+        <w:pStyle w:val="1"/>
+      </w:pPr>
+      <w:r>
+        <w:lastRenderedPageBreak/>
+        <w:t>Глава 3. Реализация и тестирование системы</w:t>
+      </w:r>
+    </w:p>
+    <w:p>
+      <w:pPr>
+        <w:pStyle w:val="2"/>
+      </w:pPr>
+      <w:r>
+        <w:t>3.1 Общее описание программного комплекса</w:t>
+      </w:r>
+    </w:p>
+    <w:p>
+      <w:r>
+        <w:t xml:space="preserve">АСУ «Заряди сам» </w:t>
+      </w:r>
+      <w:r>
+        <w:t>разработан</w:t>
+      </w:r>
+      <w:r>
+        <w:t xml:space="preserve"> и выполняет сценарии, </w:t>
+      </w:r>
+      <w:r>
+        <w:t>указанные</w:t>
+      </w:r>
+      <w:r>
+        <w:t xml:space="preserve"> в пункте 2.11. </w:t>
+      </w:r>
+      <w:r>
+        <w:t>АСУ состоит из: серверной части,</w:t>
+      </w:r>
+      <w:r>
+        <w:t xml:space="preserve"> мобильного приложения и портала администратора. </w:t>
+      </w:r>
+      <w:r>
+        <w:t>Используемая база данных</w:t>
+      </w:r>
+      <w:r>
+        <w:t xml:space="preserve"> PostgreSQL. Зарядная станци</w:t>
+      </w:r>
+      <w:r>
+        <w:t>и являются внешним оборудованием</w:t>
+      </w:r>
+      <w:r>
+        <w:t>.</w:t>
+      </w:r>
+      <w:r>
+        <w:t xml:space="preserve"> Для проверки работоспособности использовался эмулятор </w:t>
+      </w:r>
+      <w:r>
+        <w:t>протокола OCPP 2.0.1.</w:t>
+      </w:r>
+    </w:p>
+    <w:p>
+      <w:r>
+        <w:t xml:space="preserve">Серверная часть </w:t>
+      </w:r>
+      <w:r>
+        <w:t>реализована</w:t>
+      </w:r>
+      <w:r>
+        <w:t xml:space="preserve"> на ASP.NET Core</w:t>
+      </w:r>
+      <w:r>
+        <w:t xml:space="preserve"> с использованием языка </w:t>
+      </w:r>
+      <w:r>
+        <w:rPr>
+          <w:lang w:val="en-US"/>
+        </w:rPr>
+        <w:t>C</w:t>
+      </w:r>
+      <w:r>
+        <w:t>#</w:t>
+      </w:r>
+      <w:r>
+        <w:t xml:space="preserve"> и собрана из двух проектов. </w:t>
+      </w:r>
+      <w:r>
+        <w:t xml:space="preserve">Проект </w:t>
+      </w:r>
+      <w:r>
+        <w:t>ChargingServer.Server</w:t>
+      </w:r>
+      <w:r>
+        <w:t>,</w:t>
+      </w:r>
+      <w:r>
+        <w:t xml:space="preserve"> </w:t>
+      </w:r>
+      <w:r>
+        <w:t>является точкой входа для внешних систем</w:t>
+      </w:r>
+      <w:r>
+        <w:t>. ChargingServer.Ocpp</w:t>
+      </w:r>
+      <w:r>
+        <w:t>,</w:t>
+      </w:r>
+      <w:r>
+        <w:t xml:space="preserve"> </w:t>
+      </w:r>
+      <w:r>
+        <w:t xml:space="preserve">получает данные от проекта </w:t>
+      </w:r>
+      <w:r>
+        <w:t>ChargingServer.Server</w:t>
+      </w:r>
+      <w:r>
+        <w:t xml:space="preserve"> и обрабатывает сообщения </w:t>
+      </w:r>
+      <w:r>
+        <w:rPr>
+          <w:lang w:val="en-US"/>
+        </w:rPr>
+        <w:t>OCPP</w:t>
+      </w:r>
+      <w:r>
+        <w:t>. Оба проекта запускаются одним</w:t>
+      </w:r>
+      <w:r>
+        <w:t xml:space="preserve"> в одном</w:t>
+      </w:r>
+      <w:r>
+        <w:t xml:space="preserve"> процесс</w:t>
+      </w:r>
+      <w:r>
+        <w:t>е</w:t>
+      </w:r>
+      <w:r>
+        <w:t>. Журнал обмена со станцией пишется в отдельный файл</w:t>
+      </w:r>
+      <w:r>
+        <w:t xml:space="preserve"> </w:t>
+      </w:r>
+      <w:r>
+        <w:t>логирования</w:t>
+      </w:r>
+      <w:r>
+        <w:t>.</w:t>
+      </w:r>
+    </w:p>
+    <w:p>
+      <w:r>
+        <w:t xml:space="preserve">Станция подключается по адресу вида </w:t>
+      </w:r>
+      <w:r>
+        <w:t>«</w:t>
+      </w:r>
+      <w:r>
+        <w:t>/ocpp/{признак учётной записи}/{идентификатор станции}</w:t>
+      </w:r>
+      <w:r>
+        <w:t>»</w:t>
+      </w:r>
+      <w:r>
+        <w:t>,</w:t>
+      </w:r>
+      <w:r>
+        <w:t xml:space="preserve"> «</w:t>
+      </w:r>
+      <w:r>
+        <w:t>идентификатор станции</w:t>
+      </w:r>
+      <w:r>
+        <w:t>» - указывается станцией, а не системой</w:t>
+      </w:r>
+      <w:r>
+        <w:t xml:space="preserve">. Соединение принимается только как WebSocket с </w:t>
+      </w:r>
+      <w:r>
+        <w:t>указанием в заголовке версии протокола</w:t>
+      </w:r>
+      <w:r>
+        <w:t xml:space="preserve"> </w:t>
+      </w:r>
+      <w:r>
+        <w:t>«</w:t>
+      </w:r>
+      <w:r>
+        <w:t>ocpp2.0.1</w:t>
+      </w:r>
+      <w:r>
+        <w:t>»</w:t>
+      </w:r>
+      <w:r>
+        <w:t>. По</w:t>
+      </w:r>
+      <w:r>
+        <w:t xml:space="preserve"> </w:t>
+      </w:r>
+      <w:r>
+        <w:t>данному</w:t>
+      </w:r>
+      <w:r>
+        <w:t xml:space="preserve"> </w:t>
+      </w:r>
+      <w:r>
+        <w:t>соединению</w:t>
+      </w:r>
+      <w:r>
+        <w:t xml:space="preserve"> </w:t>
+      </w:r>
+      <w:r>
+        <w:t>идут</w:t>
+      </w:r>
+      <w:r>
+        <w:t xml:space="preserve"> </w:t>
+      </w:r>
+      <w:r>
+        <w:t>поступают</w:t>
+      </w:r>
+      <w:r>
+        <w:t xml:space="preserve"> </w:t>
+      </w:r>
+      <w:r>
+        <w:t>все</w:t>
+      </w:r>
+      <w:r>
+        <w:t xml:space="preserve"> </w:t>
+      </w:r>
+      <w:r>
+        <w:rPr>
+          <w:lang w:val="en-US"/>
+        </w:rPr>
+        <w:t>OCPP</w:t>
+      </w:r>
+      <w:r>
+        <w:t xml:space="preserve"> </w:t>
+      </w:r>
+      <w:r>
+        <w:t>сообщения</w:t>
+      </w:r>
+      <w:r>
+        <w:t>.</w:t>
+      </w:r>
+      <w:r>
+        <w:t xml:space="preserve"> Если оно разрывается, сервер помечает станцию недоступной</w:t>
+      </w:r>
+      <w:r>
+        <w:t xml:space="preserve"> и уведомляет об этом приложение</w:t>
+      </w:r>
+      <w:r>
+        <w:t>.</w:t>
+      </w:r>
+    </w:p>
+    <w:p>
+      <w:r>
+        <w:t xml:space="preserve">Мобильное приложение </w:t>
+      </w:r>
+      <w:r>
+        <w:t xml:space="preserve">– реализовано на базе </w:t>
+      </w:r>
+      <w:r>
+        <w:t xml:space="preserve">фраймворка </w:t>
+      </w:r>
+      <w:r>
+        <w:rPr>
+          <w:lang w:val="en-US"/>
+        </w:rPr>
         <w:t>Flutter</w:t>
       </w:r>
-      <w:proofErr w:type="spellEnd"/>
-      <w:r>
-        <w:t>. Экраны приложения и портала спроектированы</w:t>
-      </w:r>
-      <w:r>
-        <w:t xml:space="preserve"> и предоставлены в виде макетов</w:t>
-      </w:r>
-      <w:r>
-        <w:t xml:space="preserve">. Приёмка в главе 3 выполняется </w:t>
-      </w:r>
-      <w:proofErr w:type="gramStart"/>
-      <w:r>
-        <w:t>по контрольным примерам</w:t>
-      </w:r>
-      <w:proofErr w:type="gramEnd"/>
-      <w:r>
-        <w:t xml:space="preserve"> приведенным в данной главе</w:t>
-      </w:r>
-      <w:r>
-        <w:t>: привязка станции, запуск не более чем за три действия, отказ без создания сессии, история своих завершённых сессий, смена пароля пользователем и администратором.</w:t>
-      </w:r>
-    </w:p>
-    <w:p>
+      <w:r>
+        <w:t xml:space="preserve"> </w:t>
+      </w:r>
+      <w:r>
+        <w:rPr>
+          <w:lang w:val="en-US"/>
+        </w:rPr>
+        <w:t>c</w:t>
+      </w:r>
+      <w:r>
+        <w:t xml:space="preserve"> </w:t>
+      </w:r>
+      <w:r>
+        <w:t xml:space="preserve">использованием языка </w:t>
+      </w:r>
+      <w:r>
+        <w:rPr>
+          <w:lang w:val="en-US"/>
+        </w:rPr>
+        <w:t>Dart</w:t>
+      </w:r>
+      <w:r>
+        <w:t>.</w:t>
+      </w:r>
+      <w:r>
+        <w:t xml:space="preserve"> В </w:t>
+      </w:r>
+      <w:r>
+        <w:t>приложении реализованы</w:t>
+      </w:r>
+      <w:r>
+        <w:t xml:space="preserve"> вход, регистрация, список станций, добавление станции, старт сессии, текущая сессия, история</w:t>
+      </w:r>
+      <w:r>
+        <w:t xml:space="preserve"> сессий</w:t>
+      </w:r>
+      <w:r>
+        <w:t>, профиль и смена пароля.</w:t>
+      </w:r>
+      <w:r>
+        <w:t xml:space="preserve"> Коммуникация с сервером осуществляется по двум протоколам: </w:t>
+      </w:r>
+      <w:r>
+        <w:rPr>
+          <w:lang w:val="en-US"/>
+        </w:rPr>
+        <w:t>HTTP</w:t>
+      </w:r>
+      <w:r>
+        <w:t xml:space="preserve"> </w:t>
+      </w:r>
+      <w:r>
+        <w:t xml:space="preserve">и </w:t>
+      </w:r>
+      <w:r>
+        <w:rPr>
+          <w:lang w:val="en-US"/>
+        </w:rPr>
+        <w:t>WebSocket</w:t>
+      </w:r>
+      <w:r>
+        <w:t xml:space="preserve">. </w:t>
+      </w:r>
+      <w:r>
+        <w:rPr>
+          <w:lang w:val="en-US"/>
+        </w:rPr>
+        <w:t>HTTP</w:t>
+      </w:r>
+      <w:r>
+        <w:t xml:space="preserve"> </w:t>
+      </w:r>
+      <w:r>
+        <w:t xml:space="preserve">используется для получения первичных данных, а </w:t>
+      </w:r>
+      <w:r>
+        <w:rPr>
+          <w:lang w:val="en-US"/>
+        </w:rPr>
+        <w:t>WebSocket</w:t>
+      </w:r>
+      <w:r>
+        <w:t xml:space="preserve"> для быстрого обновления информации по статусам станции, коннекторов и информации по сессии.</w:t>
+      </w:r>
+    </w:p>
+    <w:p/>
+    <w:p>
+      <w:r>
+        <w:t>Портал администратора</w:t>
+      </w:r>
+      <w:r>
+        <w:t>, реализован при помощи</w:t>
+      </w:r>
+      <w:r>
+        <w:t xml:space="preserve"> фреймворка</w:t>
+      </w:r>
+      <w:r>
+        <w:t xml:space="preserve"> Vue.js. </w:t>
+      </w:r>
+      <w:r>
+        <w:t xml:space="preserve">Портал является частью </w:t>
+      </w:r>
+      <w:r>
+        <w:t>серверно</w:t>
+      </w:r>
+      <w:r>
+        <w:t>го</w:t>
+      </w:r>
+      <w:r>
+        <w:t xml:space="preserve"> решение и открывается в браузере. В портале два экрана: вход и список пользователей. Из списка администратор </w:t>
+      </w:r>
+      <w:r>
+        <w:lastRenderedPageBreak/>
+        <w:t>имеет возможность за</w:t>
+      </w:r>
+      <w:r>
+        <w:t>блоки</w:t>
+      </w:r>
+      <w:r>
+        <w:t>ровать</w:t>
+      </w:r>
+      <w:r>
+        <w:t xml:space="preserve"> учётную запись, задаёт пароль другому пользователю и меняет свой пароль. К серверу портал обращается по</w:t>
+      </w:r>
+      <w:r>
+        <w:t xml:space="preserve"> протоколу</w:t>
+      </w:r>
+      <w:r>
+        <w:t xml:space="preserve"> HTTP.</w:t>
+      </w:r>
+    </w:p>
+    <w:p>
+      <w:r>
+        <w:t xml:space="preserve">Сессия создаётся после ответа станции </w:t>
+      </w:r>
+      <w:r>
+        <w:t>«</w:t>
+      </w:r>
+      <w:r>
+        <w:t>Accepted</w:t>
+      </w:r>
+      <w:r>
+        <w:t>»</w:t>
+      </w:r>
+      <w:r>
+        <w:t xml:space="preserve"> на </w:t>
+      </w:r>
+      <w:r>
+        <w:t>«</w:t>
+      </w:r>
+      <w:r>
+        <w:t>RequestStartTransaction</w:t>
+      </w:r>
+      <w:r>
+        <w:t>»</w:t>
+      </w:r>
+      <w:r>
+        <w:t xml:space="preserve">. Время начала и начальное значение счётчика в этот момент </w:t>
+      </w:r>
+      <w:r>
+        <w:t>не устанавливаются</w:t>
+      </w:r>
+      <w:r>
+        <w:t xml:space="preserve">. Они заполняются </w:t>
+      </w:r>
+      <w:r>
+        <w:t xml:space="preserve">после получения </w:t>
+      </w:r>
+      <w:r>
+        <w:t>сообщени</w:t>
+      </w:r>
+      <w:r>
+        <w:t>я</w:t>
+      </w:r>
+      <w:r>
+        <w:t xml:space="preserve"> </w:t>
+      </w:r>
+      <w:r>
+        <w:t>«</w:t>
+      </w:r>
+      <w:r>
+        <w:t>TransactionEvent</w:t>
+      </w:r>
+      <w:r>
+        <w:t>»</w:t>
+      </w:r>
+      <w:r>
+        <w:t xml:space="preserve"> с типом </w:t>
+      </w:r>
+      <w:r>
+        <w:t>«</w:t>
+      </w:r>
+      <w:r>
+        <w:t>Started</w:t>
+      </w:r>
+      <w:r>
+        <w:t>»</w:t>
+      </w:r>
+      <w:r>
+        <w:t>. Сообщение</w:t>
+      </w:r>
+      <w:r>
+        <w:t xml:space="preserve"> с типом</w:t>
+      </w:r>
+      <w:r>
+        <w:t xml:space="preserve"> </w:t>
+      </w:r>
+      <w:r>
+        <w:t>«</w:t>
+      </w:r>
+      <w:r>
+        <w:t>Updated</w:t>
+      </w:r>
+      <w:r>
+        <w:t>»</w:t>
+      </w:r>
+      <w:r>
+        <w:t xml:space="preserve"> обновляет конечное значение счётчика. Сообщение</w:t>
+      </w:r>
+      <w:r>
+        <w:t xml:space="preserve"> с типом</w:t>
+      </w:r>
+      <w:r>
+        <w:t xml:space="preserve"> </w:t>
+      </w:r>
+      <w:r>
+        <w:t>«</w:t>
+      </w:r>
+      <w:r>
+        <w:t>Ended</w:t>
+      </w:r>
+      <w:r>
+        <w:t>»</w:t>
+      </w:r>
+      <w:r>
+        <w:t xml:space="preserve"> записывает время окончания и конечное значение, после </w:t>
+      </w:r>
+      <w:r>
+        <w:t>этого</w:t>
+      </w:r>
+      <w:r>
+        <w:t xml:space="preserve"> сессия </w:t>
+      </w:r>
+      <w:r>
+        <w:t xml:space="preserve">считается </w:t>
+      </w:r>
+      <w:r>
+        <w:t>завершённ</w:t>
+      </w:r>
+      <w:r>
+        <w:t>ой</w:t>
+      </w:r>
+      <w:r>
+        <w:t xml:space="preserve"> и </w:t>
+      </w:r>
+      <w:r>
+        <w:t>появляется</w:t>
+      </w:r>
+      <w:r>
+        <w:t xml:space="preserve"> в истории. Энергия на экране истории считается по разности показаний счётчика и показывается в кВт·ч. </w:t>
+      </w:r>
+      <w:r>
+        <w:t>Пользователь может выполнять не больше одной текущей сессии</w:t>
+      </w:r>
+      <w:r>
+        <w:t>. Если станция недоступна</w:t>
+      </w:r>
+      <w:r>
+        <w:t xml:space="preserve"> </w:t>
+      </w:r>
+      <w:r>
+        <w:t xml:space="preserve">или ответ не </w:t>
+      </w:r>
+      <w:r>
+        <w:t>«</w:t>
+      </w:r>
+      <w:r>
+        <w:t>Accepted</w:t>
+      </w:r>
+      <w:r>
+        <w:t>»</w:t>
+      </w:r>
+      <w:r>
+        <w:t>, сессия не создаётся, пользователь видит сообщение</w:t>
+      </w:r>
+      <w:r>
+        <w:t xml:space="preserve"> об ошибке</w:t>
+      </w:r>
+      <w:r>
+        <w:t>.</w:t>
+      </w:r>
+    </w:p>
+    <w:p>
+      <w:r>
+        <w:t xml:space="preserve">Пользователь видит только свои станции и свои сессии. Администратор </w:t>
+      </w:r>
+      <w:r>
+        <w:t>не имеет возможности запустить зарядку для пользователя</w:t>
+      </w:r>
+      <w:r>
+        <w:t xml:space="preserve">. </w:t>
+      </w:r>
+    </w:p>
+    <w:p>
+      <w:pPr>
+        <w:spacing w:after="160" w:line="259" w:lineRule="auto"/>
+        <w:ind w:firstLine="0"/>
+        <w:jc w:val="left"/>
+      </w:pPr>
       <w:r>
         <w:br w:type="page"/>
       </w:r>
     </w:p>
+    <w:p/>
     <w:p>
       <w:pPr>
         <w:pStyle w:val="1"/>
@@ -12251,7 +12027,6 @@
       </w:pPr>
       <w:bookmarkStart w:id="44" w:name="_Toc242914555"/>
       <w:r>
-        <w:lastRenderedPageBreak/>
         <w:t>Список источников</w:t>
       </w:r>
       <w:bookmarkEnd w:id="44"/>
@@ -12262,14 +12037,7 @@
       </w:r>
       <w:r>
         <w:tab/>
-      </w:r>
-      <w:proofErr w:type="spellStart"/>
-      <w:r>
-        <w:t>Рудинский</w:t>
-      </w:r>
-      <w:proofErr w:type="spellEnd"/>
-      <w:r>
-        <w:t xml:space="preserve"> И.Д. Учебно-методическое пособие по выполнению курсового проекта для студентов, обучающихся в бакалавриате по направлению подготовки «Прикладная информатика» - Калининград: КГТУ, 2015г. – 63 с.</w:t>
+        <w:t>Рудинский И.Д. Учебно-методическое пособие по выполнению курсового проекта для студентов, обучающихся в бакалавриате по направлению подготовки «Прикладная информатика» - Калининград: КГТУ, 2015г. – 63 с.</w:t>
       </w:r>
     </w:p>
     <w:p>
@@ -12331,14 +12099,7 @@
       </w:r>
       <w:r>
         <w:tab/>
-      </w:r>
-      <w:proofErr w:type="spellStart"/>
-      <w:r>
-        <w:t>Punkt</w:t>
-      </w:r>
-      <w:proofErr w:type="spellEnd"/>
-      <w:r>
-        <w:t xml:space="preserve"> E. Официальный сайт [Электронный ресурс]. </w:t>
+        <w:t xml:space="preserve">Punkt E. Официальный сайт [Электронный ресурс]. </w:t>
       </w:r>
       <w:r>
         <w:t>-</w:t>
@@ -12359,23 +12120,7 @@
       </w:r>
       <w:r>
         <w:tab/>
-        <w:t xml:space="preserve">PUNKT E консолидирует рынок, приобретая операторский бизнес </w:t>
-      </w:r>
-      <w:proofErr w:type="spellStart"/>
-      <w:r>
-        <w:t>Sitronics</w:t>
-      </w:r>
-      <w:proofErr w:type="spellEnd"/>
-      <w:r>
-        <w:t xml:space="preserve"> </w:t>
-      </w:r>
-      <w:proofErr w:type="spellStart"/>
-      <w:r>
-        <w:t>Electro</w:t>
-      </w:r>
-      <w:proofErr w:type="spellEnd"/>
-      <w:r>
-        <w:t xml:space="preserve"> [Электронный ресурс] // PUNKT E. </w:t>
+        <w:t xml:space="preserve">PUNKT E консолидирует рынок, приобретая операторский бизнес Sitronics Electro [Электронный ресурс] // PUNKT E. </w:t>
       </w:r>
       <w:r>
         <w:t>-</w:t>
@@ -12424,23 +12169,18 @@
     </w:p>
     <w:p>
       <w:r>
+        <w:lastRenderedPageBreak/>
         <w:t>10.</w:t>
       </w:r>
       <w:r>
         <w:tab/>
       </w:r>
-      <w:proofErr w:type="spellStart"/>
-      <w:r>
-        <w:t>Voltfuel</w:t>
-      </w:r>
-      <w:proofErr w:type="spellEnd"/>
-      <w:r>
-        <w:t>. Сеть зарядных станций для электромобилей [Электронный ресурс]. — URL: https://voltfuel.ru/ (дата обращения: 25.09.2026).</w:t>
-      </w:r>
-    </w:p>
-    <w:p>
-      <w:r>
-        <w:lastRenderedPageBreak/>
+      <w:r>
+        <w:t>Voltfuel. Сеть зарядных станций для электромобилей [Электронный ресурс]. — URL: https://voltfuel.ru/ (дата обращения: 25.09.2026).</w:t>
+      </w:r>
+    </w:p>
+    <w:p>
+      <w:r>
         <w:t>1</w:t>
       </w:r>
       <w:r>
@@ -12528,15 +12268,7 @@
       </w:r>
       <w:r>
         <w:tab/>
-        <w:t xml:space="preserve">В России вырос спрос на персональные зарядные устройства для электромобилей и гибридов [Электронный ресурс] // </w:t>
-      </w:r>
-      <w:proofErr w:type="spellStart"/>
-      <w:r>
-        <w:t>Автостат</w:t>
-      </w:r>
-      <w:proofErr w:type="spellEnd"/>
-      <w:r>
-        <w:t xml:space="preserve">. </w:t>
+        <w:t xml:space="preserve">В России вырос спрос на персональные зарядные устройства для электромобилей и гибридов [Электронный ресурс] // Автостат. </w:t>
       </w:r>
       <w:r>
         <w:t>-</w:t>

</xml_diff>